<commit_message>
Ajusta relatório às disciplinas do período (BD, IA, sustentabilidade)
Co-Authored-By: Claude Opus 5.5 <noreply@anthropic.com>
Claude-Session: https://claude.ai/code/session_01MQeZVpoZuKpj9XNzeFuo6D
</commit_message>
<xml_diff>
--- a/projeto-integrador/Relatorio_Projeto_Integrador_GTI.docx
+++ b/projeto-integrador/Relatorio_Projeto_Integrador_GTI.docx
@@ -344,7 +344,7 @@
                 <w:szCs w:val="24"/>
                 <w:shd w:fill="FFF200" w:color="auto" w:val="clear"/>
               </w:rPr>
-              <w:t xml:space="preserve">[ex.: 3º período]</w:t>
+              <w:t xml:space="preserve">1º período (confirme)</w:t>
             </w:r>
           </w:p>
         </w:tc>
@@ -497,7 +497,7 @@
           <w:sz w:val="20"/>
           <w:szCs w:val="20"/>
         </w:rPr>
-        <w:t xml:space="preserve">Troque pelas disciplinas reais do seu semestre (estão no portal). As abaixo são as que mais combinam com o tema.</w:t>
+        <w:t xml:space="preserve">Disciplinas do período atual relacionadas ao projeto.</w:t>
       </w:r>
     </w:p>
     <w:p>
@@ -514,9 +514,8 @@
           <w:rFonts w:ascii="Arial" w:cs="Arial" w:eastAsia="Arial" w:hAnsi="Arial"/>
           <w:sz w:val="24"/>
           <w:szCs w:val="24"/>
-          <w:shd w:fill="FFF200" w:color="auto" w:val="clear"/>
-        </w:rPr>
-        <w:t xml:space="preserve">[Gerenciamento de Serviços de TI / ITIL]</w:t>
+        </w:rPr>
+        <w:t xml:space="preserve">Gestão e Governança em TI</w:t>
       </w:r>
     </w:p>
     <w:p>
@@ -533,9 +532,8 @@
           <w:rFonts w:ascii="Arial" w:cs="Arial" w:eastAsia="Arial" w:hAnsi="Arial"/>
           <w:sz w:val="24"/>
           <w:szCs w:val="24"/>
-          <w:shd w:fill="FFF200" w:color="auto" w:val="clear"/>
-        </w:rPr>
-        <w:t xml:space="preserve">[Governança de TI / COBIT]</w:t>
+        </w:rPr>
+        <w:t xml:space="preserve">Gestão da Tecnologia da Informação e Comunicação</w:t>
       </w:r>
     </w:p>
     <w:p>
@@ -552,9 +550,8 @@
           <w:rFonts w:ascii="Arial" w:cs="Arial" w:eastAsia="Arial" w:hAnsi="Arial"/>
           <w:sz w:val="24"/>
           <w:szCs w:val="24"/>
-          <w:shd w:fill="FFF200" w:color="auto" w:val="clear"/>
-        </w:rPr>
-        <w:t xml:space="preserve">[Segurança da Informação]</w:t>
+        </w:rPr>
+        <w:t xml:space="preserve">Banco de Dados</w:t>
       </w:r>
     </w:p>
     <w:p>
@@ -571,9 +568,26 @@
           <w:rFonts w:ascii="Arial" w:cs="Arial" w:eastAsia="Arial" w:hAnsi="Arial"/>
           <w:sz w:val="24"/>
           <w:szCs w:val="24"/>
-          <w:shd w:fill="FFF200" w:color="auto" w:val="clear"/>
-        </w:rPr>
-        <w:t xml:space="preserve">[Redes / Sistemas Operacionais / Infraestrutura]</w:t>
+        </w:rPr>
+        <w:t xml:space="preserve">Inteligência Artificial</w:t>
+      </w:r>
+    </w:p>
+    <w:p>
+      <w:pPr>
+        <w:pStyle w:val="ListParagraph"/>
+        <w:numPr>
+          <w:ilvl w:val="0"/>
+          <w:numId w:val="2"/>
+        </w:numPr>
+        <w:spacing w:after="80" w:line="320"/>
+      </w:pPr>
+      <w:r>
+        <w:rPr>
+          <w:rFonts w:ascii="Arial" w:cs="Arial" w:eastAsia="Arial" w:hAnsi="Arial"/>
+          <w:sz w:val="24"/>
+          <w:szCs w:val="24"/>
+        </w:rPr>
+        <w:t xml:space="preserve">Meio Ambiente, Desenvolvimento e Sustentabilidade</w:t>
       </w:r>
     </w:p>
     <w:p>
@@ -603,7 +617,7 @@
           <w:sz w:val="24"/>
           <w:szCs w:val="24"/>
         </w:rPr>
-        <w:t xml:space="preserve">Padronização do fluxo de atendimento de incidentes e de requisições de acesso (Active Directory) no suporte de TI de uma operação logística com WMS, com base nas práticas do ITIL 4 e nos controles de acesso da ISO/IEC 27002:2022.</w:t>
+        <w:t xml:space="preserve">Padronização do fluxo de atendimento de incidentes e de requisições de acesso (Active Directory e WMS) no suporte de TI de uma operação logística, com base nas práticas do ITIL 4, no COBIT 2019 e nos controles de acesso da ISO/IEC 27002:2022, usando banco de dados para análise dos chamados e das contas de usuário.</w:t>
       </w:r>
     </w:p>
     <w:p>
@@ -665,7 +679,7 @@
           <w:sz w:val="24"/>
           <w:szCs w:val="24"/>
         </w:rPr>
-        <w:t xml:space="preserve">Mapear o fluxo atual de atendimento e registrar os principais tipos de chamado de um período de referência.</w:t>
+        <w:t xml:space="preserve">Levantar os chamados de um período de referência e organizá-los em uma tabela de banco de dados, com consultas SQL para identificar os tipos mais frequentes.</w:t>
       </w:r>
     </w:p>
     <w:p>
@@ -701,7 +715,7 @@
           <w:sz w:val="24"/>
           <w:szCs w:val="24"/>
         </w:rPr>
-        <w:t xml:space="preserve">Elaborar um checklist de admissão, transferência e desligamento de usuários (concessão e revogação de acessos no AD e no WMS).</w:t>
+        <w:t xml:space="preserve">Elaborar um checklist de admissão, transferência e desligamento de usuários (concessão e revogação de acessos no AD e no WMS, e devolução de equipamentos).</w:t>
       </w:r>
     </w:p>
     <w:p>
@@ -959,7 +973,7 @@
                 <w:sz w:val="22"/>
                 <w:szCs w:val="22"/>
               </w:rPr>
-              <w:t xml:space="preserve">Levantamento: exportação/listagem dos chamados de </w:t>
+              <w:t xml:space="preserve">Levantamento: exportação dos chamados de </w:t>
             </w:r>
             <w:r>
               <w:rPr>
@@ -976,7 +990,7 @@
                 <w:sz w:val="22"/>
                 <w:szCs w:val="22"/>
               </w:rPr>
-              <w:t xml:space="preserve"> e anotação dos tipos mais frequentes (ex.: senha bloqueada, coletor sem conexão, impressora de etiqueta, novo usuário no WMS).</w:t>
+              <w:t xml:space="preserve"> para uma tabela (colunas: data, setor, descrição, categoria, prioridade, tempo de solução) e consultas SQL com GROUP BY para contar os tipos mais frequentes (ex.: senha bloqueada, coletor sem conexão, impressora de etiqueta, novo usuário no WMS).</w:t>
             </w:r>
           </w:p>
         </w:tc>
@@ -1033,29 +1047,8 @@
                 <w:sz w:val="22"/>
                 <w:szCs w:val="22"/>
               </w:rPr>
-              <w:t xml:space="preserve">Classificação: separação dos chamados em incidente, requisição de serviço e problema, conforme conceitos do ITIL 4.</w:t>
-            </w:r>
-          </w:p>
-        </w:tc>
-      </w:tr>
-      <w:tr>
-        <w:tc>
-          <w:tcPr>
-            <w:tcW w:type="dxa" w:w="1800"/>
-            <w:tcBorders>
-              <w:top w:val="single" w:color="999999" w:sz="4"/>
-              <w:left w:val="single" w:color="999999" w:sz="4"/>
-              <w:bottom w:val="single" w:color="999999" w:sz="4"/>
-              <w:right w:val="single" w:color="999999" w:sz="4"/>
-            </w:tcBorders>
-            <w:tcMar>
-              <w:top w:type="dxa" w:w="80"/>
-              <w:left w:type="dxa" w:w="120"/>
-              <w:bottom w:type="dxa" w:w="80"/>
-              <w:right w:type="dxa" w:w="120"/>
-            </w:tcMar>
-          </w:tcPr>
-          <w:p>
+              <w:t xml:space="preserve">Apoio de IA: uso de uma ferramenta de IA generativa para sugerir categorias a partir das descrições dos chamados, após remover nomes, logins e dados da empresa. Todas as sugestões foram conferidas manualmente, e </w:t>
+            </w:r>
             <w:r>
               <w:rPr>
                 <w:rFonts w:ascii="Arial" w:cs="Arial" w:eastAsia="Arial" w:hAnsi="Arial"/>
@@ -1063,56 +1056,16 @@
                 <w:szCs w:val="24"/>
                 <w:shd w:fill="FFF200" w:color="auto" w:val="clear"/>
               </w:rPr>
-              <w:t xml:space="preserve">[data]</w:t>
-            </w:r>
-          </w:p>
-        </w:tc>
-        <w:tc>
-          <w:tcPr>
-            <w:tcW w:type="dxa" w:w="7226"/>
-            <w:tcBorders>
-              <w:top w:val="single" w:color="999999" w:sz="4"/>
-              <w:left w:val="single" w:color="999999" w:sz="4"/>
-              <w:bottom w:val="single" w:color="999999" w:sz="4"/>
-              <w:right w:val="single" w:color="999999" w:sz="4"/>
-            </w:tcBorders>
-            <w:tcMar>
-              <w:top w:type="dxa" w:w="80"/>
-              <w:left w:type="dxa" w:w="120"/>
-              <w:bottom w:type="dxa" w:w="80"/>
-              <w:right w:type="dxa" w:w="120"/>
-            </w:tcMar>
-          </w:tcPr>
-          <w:p>
-            <w:r>
-              <w:rPr>
-                <w:rFonts w:ascii="Arial" w:cs="Arial" w:eastAsia="Arial" w:hAnsi="Arial"/>
-                <w:sz w:val="22"/>
-                <w:szCs w:val="22"/>
-              </w:rPr>
-              <w:t xml:space="preserve">Matriz de prioridade: definição de impacto (quantos usuários/setores param) × urgência (quanto tempo a operação aguenta), gerando prioridades P1 a P4.</w:t>
-            </w:r>
-          </w:p>
-        </w:tc>
-      </w:tr>
-      <w:tr>
-        <w:tc>
-          <w:tcPr>
-            <w:tcW w:type="dxa" w:w="1800"/>
-            <w:tcBorders>
-              <w:top w:val="single" w:color="999999" w:sz="4"/>
-              <w:left w:val="single" w:color="999999" w:sz="4"/>
-              <w:bottom w:val="single" w:color="999999" w:sz="4"/>
-              <w:right w:val="single" w:color="999999" w:sz="4"/>
-            </w:tcBorders>
-            <w:tcMar>
-              <w:top w:type="dxa" w:w="80"/>
-              <w:left w:type="dxa" w:w="120"/>
-              <w:bottom w:type="dxa" w:w="80"/>
-              <w:right w:type="dxa" w:w="120"/>
-            </w:tcMar>
-          </w:tcPr>
-          <w:p>
+              <w:t xml:space="preserve">[X]</w:t>
+            </w:r>
+            <w:r>
+              <w:rPr>
+                <w:rFonts w:ascii="Arial" w:cs="Arial" w:eastAsia="Arial" w:hAnsi="Arial"/>
+                <w:sz w:val="22"/>
+                <w:szCs w:val="22"/>
+              </w:rPr>
+              <w:t xml:space="preserve"> de </w:t>
+            </w:r>
             <w:r>
               <w:rPr>
                 <w:rFonts w:ascii="Arial" w:cs="Arial" w:eastAsia="Arial" w:hAnsi="Arial"/>
@@ -1120,34 +1073,15 @@
                 <w:szCs w:val="24"/>
                 <w:shd w:fill="FFF200" w:color="auto" w:val="clear"/>
               </w:rPr>
-              <w:t xml:space="preserve">[data]</w:t>
-            </w:r>
-          </w:p>
-        </w:tc>
-        <w:tc>
-          <w:tcPr>
-            <w:tcW w:type="dxa" w:w="7226"/>
-            <w:tcBorders>
-              <w:top w:val="single" w:color="999999" w:sz="4"/>
-              <w:left w:val="single" w:color="999999" w:sz="4"/>
-              <w:bottom w:val="single" w:color="999999" w:sz="4"/>
-              <w:right w:val="single" w:color="999999" w:sz="4"/>
-            </w:tcBorders>
-            <w:tcMar>
-              <w:top w:type="dxa" w:w="80"/>
-              <w:left w:type="dxa" w:w="120"/>
-              <w:bottom w:type="dxa" w:w="80"/>
-              <w:right w:type="dxa" w:w="120"/>
-            </w:tcMar>
-          </w:tcPr>
-          <w:p>
-            <w:r>
-              <w:rPr>
-                <w:rFonts w:ascii="Arial" w:cs="Arial" w:eastAsia="Arial" w:hAnsi="Arial"/>
-                <w:sz w:val="22"/>
-                <w:szCs w:val="22"/>
-              </w:rPr>
-              <w:t xml:space="preserve">Checklist de acessos: modelo com admissão, mudança de função e desligamento, incluindo AD, e-mail, WMS, VPN e coletores, com responsável e data.</w:t>
+              <w:t xml:space="preserve">[Y]</w:t>
+            </w:r>
+            <w:r>
+              <w:rPr>
+                <w:rFonts w:ascii="Arial" w:cs="Arial" w:eastAsia="Arial" w:hAnsi="Arial"/>
+                <w:sz w:val="22"/>
+                <w:szCs w:val="22"/>
+              </w:rPr>
+              <w:t xml:space="preserve"> foram aceitas sem ajuste.</w:t>
             </w:r>
           </w:p>
         </w:tc>
@@ -1204,8 +1138,29 @@
                 <w:sz w:val="22"/>
                 <w:szCs w:val="22"/>
               </w:rPr>
-              <w:t xml:space="preserve">Revisão de contas: consulta no AD por contas sem logon há mais de </w:t>
-            </w:r>
+              <w:t xml:space="preserve">Classificação: separação dos chamados em incidente, requisição de serviço e problema, conforme conceitos do ITIL 4.</w:t>
+            </w:r>
+          </w:p>
+        </w:tc>
+      </w:tr>
+      <w:tr>
+        <w:tc>
+          <w:tcPr>
+            <w:tcW w:type="dxa" w:w="1800"/>
+            <w:tcBorders>
+              <w:top w:val="single" w:color="999999" w:sz="4"/>
+              <w:left w:val="single" w:color="999999" w:sz="4"/>
+              <w:bottom w:val="single" w:color="999999" w:sz="4"/>
+              <w:right w:val="single" w:color="999999" w:sz="4"/>
+            </w:tcBorders>
+            <w:tcMar>
+              <w:top w:type="dxa" w:w="80"/>
+              <w:left w:type="dxa" w:w="120"/>
+              <w:bottom w:type="dxa" w:w="80"/>
+              <w:right w:type="dxa" w:w="120"/>
+            </w:tcMar>
+          </w:tcPr>
+          <w:p>
             <w:r>
               <w:rPr>
                 <w:rFonts w:ascii="Arial" w:cs="Arial" w:eastAsia="Arial" w:hAnsi="Arial"/>
@@ -1213,15 +1168,34 @@
                 <w:szCs w:val="24"/>
                 <w:shd w:fill="FFF200" w:color="auto" w:val="clear"/>
               </w:rPr>
-              <w:t xml:space="preserve">[90]</w:t>
-            </w:r>
-            <w:r>
-              <w:rPr>
-                <w:rFonts w:ascii="Arial" w:cs="Arial" w:eastAsia="Arial" w:hAnsi="Arial"/>
-                <w:sz w:val="22"/>
-                <w:szCs w:val="22"/>
-              </w:rPr>
-              <w:t xml:space="preserve"> dias e cruzamento com a lista de desligados enviada pelo RH.</w:t>
+              <w:t xml:space="preserve">[data]</w:t>
+            </w:r>
+          </w:p>
+        </w:tc>
+        <w:tc>
+          <w:tcPr>
+            <w:tcW w:type="dxa" w:w="7226"/>
+            <w:tcBorders>
+              <w:top w:val="single" w:color="999999" w:sz="4"/>
+              <w:left w:val="single" w:color="999999" w:sz="4"/>
+              <w:bottom w:val="single" w:color="999999" w:sz="4"/>
+              <w:right w:val="single" w:color="999999" w:sz="4"/>
+            </w:tcBorders>
+            <w:tcMar>
+              <w:top w:type="dxa" w:w="80"/>
+              <w:left w:type="dxa" w:w="120"/>
+              <w:bottom w:type="dxa" w:w="80"/>
+              <w:right w:type="dxa" w:w="120"/>
+            </w:tcMar>
+          </w:tcPr>
+          <w:p>
+            <w:r>
+              <w:rPr>
+                <w:rFonts w:ascii="Arial" w:cs="Arial" w:eastAsia="Arial" w:hAnsi="Arial"/>
+                <w:sz w:val="22"/>
+                <w:szCs w:val="22"/>
+              </w:rPr>
+              <w:t xml:space="preserve">Matriz de prioridade: definição de impacto (quantos usuários/setores param) × urgência (quanto tempo a operação aguenta), gerando prioridades P1 a P4.</w:t>
             </w:r>
           </w:p>
         </w:tc>
@@ -1278,8 +1252,29 @@
                 <w:sz w:val="22"/>
                 <w:szCs w:val="22"/>
               </w:rPr>
-              <w:t xml:space="preserve">Aplicação: uso do novo fluxo e do checklist por </w:t>
-            </w:r>
+              <w:t xml:space="preserve">Checklist de acessos: modelo com admissão, mudança de função e desligamento, incluindo AD, e-mail, WMS, VPN, coletores e devolução de equipamentos (notebook, coletor, crachá), com responsável e data.</w:t>
+            </w:r>
+          </w:p>
+        </w:tc>
+      </w:tr>
+      <w:tr>
+        <w:tc>
+          <w:tcPr>
+            <w:tcW w:type="dxa" w:w="1800"/>
+            <w:tcBorders>
+              <w:top w:val="single" w:color="999999" w:sz="4"/>
+              <w:left w:val="single" w:color="999999" w:sz="4"/>
+              <w:bottom w:val="single" w:color="999999" w:sz="4"/>
+              <w:right w:val="single" w:color="999999" w:sz="4"/>
+            </w:tcBorders>
+            <w:tcMar>
+              <w:top w:type="dxa" w:w="80"/>
+              <w:left w:type="dxa" w:w="120"/>
+              <w:bottom w:type="dxa" w:w="80"/>
+              <w:right w:type="dxa" w:w="120"/>
+            </w:tcMar>
+          </w:tcPr>
+          <w:p>
             <w:r>
               <w:rPr>
                 <w:rFonts w:ascii="Arial" w:cs="Arial" w:eastAsia="Arial" w:hAnsi="Arial"/>
@@ -1287,6 +1282,116 @@
                 <w:szCs w:val="24"/>
                 <w:shd w:fill="FFF200" w:color="auto" w:val="clear"/>
               </w:rPr>
+              <w:t xml:space="preserve">[data]</w:t>
+            </w:r>
+          </w:p>
+        </w:tc>
+        <w:tc>
+          <w:tcPr>
+            <w:tcW w:type="dxa" w:w="7226"/>
+            <w:tcBorders>
+              <w:top w:val="single" w:color="999999" w:sz="4"/>
+              <w:left w:val="single" w:color="999999" w:sz="4"/>
+              <w:bottom w:val="single" w:color="999999" w:sz="4"/>
+              <w:right w:val="single" w:color="999999" w:sz="4"/>
+            </w:tcBorders>
+            <w:tcMar>
+              <w:top w:type="dxa" w:w="80"/>
+              <w:left w:type="dxa" w:w="120"/>
+              <w:bottom w:type="dxa" w:w="80"/>
+              <w:right w:type="dxa" w:w="120"/>
+            </w:tcMar>
+          </w:tcPr>
+          <w:p>
+            <w:r>
+              <w:rPr>
+                <w:rFonts w:ascii="Arial" w:cs="Arial" w:eastAsia="Arial" w:hAnsi="Arial"/>
+                <w:sz w:val="22"/>
+                <w:szCs w:val="22"/>
+              </w:rPr>
+              <w:t xml:space="preserve">Revisão de contas: exportação via PowerShell das contas do AD sem logon há mais de </w:t>
+            </w:r>
+            <w:r>
+              <w:rPr>
+                <w:rFonts w:ascii="Arial" w:cs="Arial" w:eastAsia="Arial" w:hAnsi="Arial"/>
+                <w:sz w:val="24"/>
+                <w:szCs w:val="24"/>
+                <w:shd w:fill="FFF200" w:color="auto" w:val="clear"/>
+              </w:rPr>
+              <w:t xml:space="preserve">[90]</w:t>
+            </w:r>
+            <w:r>
+              <w:rPr>
+                <w:rFonts w:ascii="Arial" w:cs="Arial" w:eastAsia="Arial" w:hAnsi="Arial"/>
+                <w:sz w:val="22"/>
+                <w:szCs w:val="22"/>
+              </w:rPr>
+              <w:t xml:space="preserve"> dias, importação para o banco e cruzamento (JOIN) com a lista de desligados enviada pelo RH.</w:t>
+            </w:r>
+          </w:p>
+        </w:tc>
+      </w:tr>
+      <w:tr>
+        <w:tc>
+          <w:tcPr>
+            <w:tcW w:type="dxa" w:w="1800"/>
+            <w:tcBorders>
+              <w:top w:val="single" w:color="999999" w:sz="4"/>
+              <w:left w:val="single" w:color="999999" w:sz="4"/>
+              <w:bottom w:val="single" w:color="999999" w:sz="4"/>
+              <w:right w:val="single" w:color="999999" w:sz="4"/>
+            </w:tcBorders>
+            <w:tcMar>
+              <w:top w:type="dxa" w:w="80"/>
+              <w:left w:type="dxa" w:w="120"/>
+              <w:bottom w:type="dxa" w:w="80"/>
+              <w:right w:type="dxa" w:w="120"/>
+            </w:tcMar>
+          </w:tcPr>
+          <w:p>
+            <w:r>
+              <w:rPr>
+                <w:rFonts w:ascii="Arial" w:cs="Arial" w:eastAsia="Arial" w:hAnsi="Arial"/>
+                <w:sz w:val="24"/>
+                <w:szCs w:val="24"/>
+                <w:shd w:fill="FFF200" w:color="auto" w:val="clear"/>
+              </w:rPr>
+              <w:t xml:space="preserve">[data]</w:t>
+            </w:r>
+          </w:p>
+        </w:tc>
+        <w:tc>
+          <w:tcPr>
+            <w:tcW w:type="dxa" w:w="7226"/>
+            <w:tcBorders>
+              <w:top w:val="single" w:color="999999" w:sz="4"/>
+              <w:left w:val="single" w:color="999999" w:sz="4"/>
+              <w:bottom w:val="single" w:color="999999" w:sz="4"/>
+              <w:right w:val="single" w:color="999999" w:sz="4"/>
+            </w:tcBorders>
+            <w:tcMar>
+              <w:top w:type="dxa" w:w="80"/>
+              <w:left w:type="dxa" w:w="120"/>
+              <w:bottom w:type="dxa" w:w="80"/>
+              <w:right w:type="dxa" w:w="120"/>
+            </w:tcMar>
+          </w:tcPr>
+          <w:p>
+            <w:r>
+              <w:rPr>
+                <w:rFonts w:ascii="Arial" w:cs="Arial" w:eastAsia="Arial" w:hAnsi="Arial"/>
+                <w:sz w:val="22"/>
+                <w:szCs w:val="22"/>
+              </w:rPr>
+              <w:t xml:space="preserve">Aplicação: uso do novo fluxo e do checklist por </w:t>
+            </w:r>
+            <w:r>
+              <w:rPr>
+                <w:rFonts w:ascii="Arial" w:cs="Arial" w:eastAsia="Arial" w:hAnsi="Arial"/>
+                <w:sz w:val="24"/>
+                <w:szCs w:val="24"/>
+                <w:shd w:fill="FFF200" w:color="auto" w:val="clear"/>
+              </w:rPr>
               <w:t xml:space="preserve">[X dias]</w:t>
             </w:r>
             <w:r>
@@ -1335,7 +1440,7 @@
           <w:szCs w:val="24"/>
           <w:shd w:fill="FFF200" w:color="auto" w:val="clear"/>
         </w:rPr>
-        <w:t xml:space="preserve">[ex.: sistema de chamados usado na empresa, console Usuários e Computadores do AD / PowerShell, planilha Excel]</w:t>
+        <w:t xml:space="preserve">[ex.: sistema de chamados da empresa, PowerShell (módulo ActiveDirectory), SQLite ou MySQL, Excel, ferramenta de IA generativa]</w:t>
       </w:r>
       <w:r>
         <w:rPr>
@@ -1718,7 +1823,7 @@
                 <w:sz w:val="22"/>
                 <w:szCs w:val="22"/>
               </w:rPr>
-              <w:t xml:space="preserve">Tempo médio de criação de usuário (AD + WMS)</w:t>
+              <w:t xml:space="preserve">Equipamentos de desligados recolhidos para reuso</w:t>
             </w:r>
           </w:p>
         </w:tc>
@@ -1746,7 +1851,7 @@
                 <w:szCs w:val="24"/>
                 <w:shd w:fill="FFF200" w:color="auto" w:val="clear"/>
               </w:rPr>
-              <w:t xml:space="preserve">[min]</w:t>
+              <w:t xml:space="preserve">[qtd]</w:t>
             </w:r>
           </w:p>
         </w:tc>
@@ -1774,6 +1879,93 @@
                 <w:szCs w:val="24"/>
                 <w:shd w:fill="FFF200" w:color="auto" w:val="clear"/>
               </w:rPr>
+              <w:t xml:space="preserve">[qtd]</w:t>
+            </w:r>
+          </w:p>
+        </w:tc>
+      </w:tr>
+      <w:tr>
+        <w:tc>
+          <w:tcPr>
+            <w:tcW w:type="dxa" w:w="4026"/>
+            <w:tcBorders>
+              <w:top w:val="single" w:color="999999" w:sz="4"/>
+              <w:left w:val="single" w:color="999999" w:sz="4"/>
+              <w:bottom w:val="single" w:color="999999" w:sz="4"/>
+              <w:right w:val="single" w:color="999999" w:sz="4"/>
+            </w:tcBorders>
+            <w:tcMar>
+              <w:top w:type="dxa" w:w="80"/>
+              <w:left w:type="dxa" w:w="120"/>
+              <w:bottom w:type="dxa" w:w="80"/>
+              <w:right w:type="dxa" w:w="120"/>
+            </w:tcMar>
+          </w:tcPr>
+          <w:p>
+            <w:r>
+              <w:rPr>
+                <w:rFonts w:ascii="Arial" w:cs="Arial" w:eastAsia="Arial" w:hAnsi="Arial"/>
+                <w:b w:val="false"/>
+                <w:bCs w:val="false"/>
+                <w:sz w:val="22"/>
+                <w:szCs w:val="22"/>
+              </w:rPr>
+              <w:t xml:space="preserve">Tempo médio de criação de usuário (AD + WMS)</w:t>
+            </w:r>
+          </w:p>
+        </w:tc>
+        <w:tc>
+          <w:tcPr>
+            <w:tcW w:type="dxa" w:w="2500"/>
+            <w:tcBorders>
+              <w:top w:val="single" w:color="999999" w:sz="4"/>
+              <w:left w:val="single" w:color="999999" w:sz="4"/>
+              <w:bottom w:val="single" w:color="999999" w:sz="4"/>
+              <w:right w:val="single" w:color="999999" w:sz="4"/>
+            </w:tcBorders>
+            <w:tcMar>
+              <w:top w:type="dxa" w:w="80"/>
+              <w:left w:type="dxa" w:w="120"/>
+              <w:bottom w:type="dxa" w:w="80"/>
+              <w:right w:type="dxa" w:w="120"/>
+            </w:tcMar>
+          </w:tcPr>
+          <w:p>
+            <w:r>
+              <w:rPr>
+                <w:rFonts w:ascii="Arial" w:cs="Arial" w:eastAsia="Arial" w:hAnsi="Arial"/>
+                <w:sz w:val="24"/>
+                <w:szCs w:val="24"/>
+                <w:shd w:fill="FFF200" w:color="auto" w:val="clear"/>
+              </w:rPr>
+              <w:t xml:space="preserve">[min]</w:t>
+            </w:r>
+          </w:p>
+        </w:tc>
+        <w:tc>
+          <w:tcPr>
+            <w:tcW w:type="dxa" w:w="2500"/>
+            <w:tcBorders>
+              <w:top w:val="single" w:color="999999" w:sz="4"/>
+              <w:left w:val="single" w:color="999999" w:sz="4"/>
+              <w:bottom w:val="single" w:color="999999" w:sz="4"/>
+              <w:right w:val="single" w:color="999999" w:sz="4"/>
+            </w:tcBorders>
+            <w:tcMar>
+              <w:top w:type="dxa" w:w="80"/>
+              <w:left w:type="dxa" w:w="120"/>
+              <w:bottom w:type="dxa" w:w="80"/>
+              <w:right w:type="dxa" w:w="120"/>
+            </w:tcMar>
+          </w:tcPr>
+          <w:p>
+            <w:r>
+              <w:rPr>
+                <w:rFonts w:ascii="Arial" w:cs="Arial" w:eastAsia="Arial" w:hAnsi="Arial"/>
+                <w:sz w:val="24"/>
+                <w:szCs w:val="24"/>
+                <w:shd w:fill="FFF200" w:color="auto" w:val="clear"/>
+              </w:rPr>
               <w:t xml:space="preserve">[min]</w:t>
             </w:r>
           </w:p>
@@ -1805,7 +1997,7 @@
           <w:sz w:val="24"/>
           <w:szCs w:val="24"/>
         </w:rPr>
-        <w:t xml:space="preserve">Produtos entregues: matriz de prioridade, tabela de categorias de chamado e checklist de concessão e revogação de acessos, disponibilizados para a equipe de suporte.</w:t>
+        <w:t xml:space="preserve">Produtos entregues: base de dados de chamados com consultas SQL, matriz de prioridade, tabela de categorias e checklist de concessão e revogação de acessos, disponibilizados para a equipe de suporte.</w:t>
       </w:r>
     </w:p>
     <w:p>
@@ -1889,24 +2081,7 @@
           <w:sz w:val="24"/>
           <w:szCs w:val="24"/>
         </w:rPr>
-        <w:t xml:space="preserve">Foram aplicados conteúdos de </w:t>
-      </w:r>
-      <w:r>
-        <w:rPr>
-          <w:rFonts w:ascii="Arial" w:cs="Arial" w:eastAsia="Arial" w:hAnsi="Arial"/>
-          <w:sz w:val="24"/>
-          <w:szCs w:val="24"/>
-          <w:shd w:fill="FFF200" w:color="auto" w:val="clear"/>
-        </w:rPr>
-        <w:t xml:space="preserve">[disciplinas]</w:t>
-      </w:r>
-      <w:r>
-        <w:rPr>
-          <w:rFonts w:ascii="Arial" w:cs="Arial" w:eastAsia="Arial" w:hAnsi="Arial"/>
-          <w:sz w:val="24"/>
-          <w:szCs w:val="24"/>
-        </w:rPr>
-        <w:t xml:space="preserve"> e desenvolvidas competências de análise de processos, documentação técnica, comunicação com outras áreas (RH e operação) e visão de segurança da informação. </w:t>
+        <w:t xml:space="preserve">Gestão e Governança em TI deu a base de ITIL e COBIT para separar incidente de requisição e definir responsabilidades. Gestão da TIC ajudou a enxergar o suporte como serviço para a operação. Banco de Dados foi aplicado na modelagem da tabela de chamados e nas consultas que cruzaram contas do AD com a lista do RH. Inteligência Artificial apareceu no uso de IA generativa para classificar descrições, e ficou claro que ela acelera, mas não dispensa a conferência humana. Meio Ambiente e Sustentabilidade entrou no recolhimento de equipamentos no desligamento, que reduz compra nova e descarte eletrônico. </w:t>
       </w:r>
       <w:r>
         <w:rPr>

</xml_diff>

<commit_message>
Converte o projeto para cenário simulado com dados fictícios
Relatório completo com resultados e 4 figuras, planilha e banco SQLite
preenchidos com a base fictícia, e passo a passo atualizado. O relatório
declara a simulação e a premissa usada no período Depois.

Co-Authored-By: Claude Opus 5.5 <noreply@anthropic.com>
Claude-Session: https://claude.ai/code/session_01MQeZVpoZuKpj9XNzeFuo6D
</commit_message>
<xml_diff>
--- a/projeto-integrador/Relatorio_Projeto_Integrador_GTI.docx
+++ b/projeto-integrador/Relatorio_Projeto_Integrador_GTI.docx
@@ -31,7 +31,7 @@
           <w:sz w:val="28"/>
           <w:szCs w:val="28"/>
         </w:rPr>
-        <w:t xml:space="preserve">RELATÓRIO — PROJETO INTEGRADOR</w:t>
+        <w:t xml:space="preserve">RELATÓRIO — PROJETO INTEGRADOR I</w:t>
       </w:r>
     </w:p>
     <w:tbl>
@@ -77,7 +77,7 @@
                 <w:sz w:val="22"/>
                 <w:szCs w:val="22"/>
               </w:rPr>
-              <w:t xml:space="default"/>
+              <w:t xml:space="preserve">[object Object]</w:t>
             </w:r>
           </w:p>
         </w:tc>
@@ -107,7 +107,7 @@
                 <w:sz w:val="22"/>
                 <w:szCs w:val="22"/>
               </w:rPr>
-              <w:t xml:space="default"/>
+              <w:t xml:space="preserve">[object Object]</w:t>
             </w:r>
           </w:p>
         </w:tc>
@@ -221,11 +221,12 @@
             <w:r>
               <w:rPr>
                 <w:rFonts w:ascii="Arial" w:cs="Arial" w:eastAsia="Arial" w:hAnsi="Arial"/>
-                <w:sz w:val="24"/>
-                <w:szCs w:val="24"/>
-                <w:shd w:fill="FFF200" w:color="auto" w:val="clear"/>
-              </w:rPr>
-              <w:t xml:space="preserve">[dd/mm/2026 a dd/mm/2026]</w:t>
+                <w:b w:val="false"/>
+                <w:bCs w:val="false"/>
+                <w:sz w:val="22"/>
+                <w:szCs w:val="22"/>
+              </w:rPr>
+              <w:t xml:space="preserve">Setembro de 2026</w:t>
             </w:r>
           </w:p>
         </w:tc>
@@ -482,22 +483,6 @@
           <w:szCs w:val="26"/>
         </w:rPr>
         <w:t xml:space="preserve">DISCIPLINAS CURSADAS NO PERÍODO</w:t>
-      </w:r>
-    </w:p>
-    <w:p>
-      <w:pPr>
-        <w:spacing w:after="120"/>
-      </w:pPr>
-      <w:r>
-        <w:rPr>
-          <w:rFonts w:ascii="Arial" w:cs="Arial" w:eastAsia="Arial" w:hAnsi="Arial"/>
-          <w:i/>
-          <w:iCs/>
-          <w:color w:val="666666"/>
-          <w:sz w:val="20"/>
-          <w:szCs w:val="20"/>
-        </w:rPr>
-        <w:t xml:space="preserve">Disciplinas do período atual relacionadas ao projeto.</w:t>
       </w:r>
     </w:p>
     <w:p>
@@ -617,7 +602,7 @@
           <w:sz w:val="24"/>
           <w:szCs w:val="24"/>
         </w:rPr>
-        <w:t xml:space="preserve">Padronização do fluxo de atendimento de incidentes e de requisições de acesso (Active Directory e WMS) no suporte de TI de uma operação logística, com base nas práticas do ITIL 4, no COBIT 2019 e nos controles de acesso da ISO/IEC 27002:2022, usando banco de dados para análise dos chamados e das contas de usuário.</w:t>
+        <w:t xml:space="preserve">Padronização do fluxo de atendimento de incidentes e de requisições de acesso (Active Directory e WMS) no suporte de TI de um centro de distribuição, com base no ITIL 4, no COBIT 2019 e nos controles de acesso da ISO/IEC 27002:2022, desenvolvida em cenário simulado com banco de dados e apoio de inteligência artificial.</w:t>
       </w:r>
     </w:p>
     <w:p>
@@ -647,7 +632,7 @@
           <w:sz w:val="24"/>
           <w:szCs w:val="24"/>
         </w:rPr>
-        <w:t xml:space="preserve">Objetivo geral: organizar o atendimento do suporte de TI da operação, separando incidentes de requisições de serviço e criando um procedimento padrão para criar, alterar e remover acessos de usuários no Active Directory e no WMS.</w:t>
+        <w:t xml:space="preserve">Objetivo geral: organizar o atendimento do suporte de TI de uma operação logística, separando incidentes de requisições de serviço, priorizando pelo impacto na operação e criando um procedimento padrão para conceder e revogar acessos de usuários.</w:t>
       </w:r>
     </w:p>
     <w:p>
@@ -679,7 +664,7 @@
           <w:sz w:val="24"/>
           <w:szCs w:val="24"/>
         </w:rPr>
-        <w:t xml:space="preserve">Levantar os chamados de um período de referência e organizá-los em uma tabela de banco de dados, com consultas SQL para identificar os tipos mais frequentes.</w:t>
+        <w:t xml:space="preserve">Montar uma base de chamados em banco de dados e identificar, por consultas SQL, os tipos mais frequentes.</w:t>
       </w:r>
     </w:p>
     <w:p>
@@ -697,7 +682,7 @@
           <w:sz w:val="24"/>
           <w:szCs w:val="24"/>
         </w:rPr>
-        <w:t xml:space="preserve">Criar uma tabela de categorização e prioridade (impacto × urgência) para os chamados do suporte.</w:t>
+        <w:t xml:space="preserve">Criar uma matriz de prioridade (impacto × urgência) e medir o tempo médio de solução dos chamados críticos (P1 e P2) antes e depois de aplicá-la.</w:t>
       </w:r>
     </w:p>
     <w:p>
@@ -715,7 +700,7 @@
           <w:sz w:val="24"/>
           <w:szCs w:val="24"/>
         </w:rPr>
-        <w:t xml:space="preserve">Elaborar um checklist de admissão, transferência e desligamento de usuários (concessão e revogação de acessos no AD e no WMS, e devolução de equipamentos).</w:t>
+        <w:t xml:space="preserve">Elaborar um checklist de admissão, mudança de função e desligamento, incluindo a devolução de equipamentos.</w:t>
       </w:r>
     </w:p>
     <w:p>
@@ -733,24 +718,25 @@
           <w:sz w:val="24"/>
           <w:szCs w:val="24"/>
         </w:rPr>
-        <w:t xml:space="preserve">Aplicar o novo fluxo por </w:t>
-      </w:r>
-      <w:r>
-        <w:rPr>
-          <w:rFonts w:ascii="Arial" w:cs="Arial" w:eastAsia="Arial" w:hAnsi="Arial"/>
-          <w:sz w:val="24"/>
-          <w:szCs w:val="24"/>
-          <w:shd w:fill="FFF200" w:color="auto" w:val="clear"/>
-        </w:rPr>
-        <w:t xml:space="preserve">[X dias]</w:t>
-      </w:r>
-      <w:r>
-        <w:rPr>
-          <w:rFonts w:ascii="Arial" w:cs="Arial" w:eastAsia="Arial" w:hAnsi="Arial"/>
-          <w:sz w:val="24"/>
-          <w:szCs w:val="24"/>
-        </w:rPr>
-        <w:t xml:space="preserve"> e comparar com o período anterior: percentual de chamados categorizados corretamente e contas ativas de ex-colaboradores encontradas.</w:t>
+        <w:t xml:space="preserve">Cruzar as contas inativas do Active Directory com a lista de desligados do RH e quantificar as contas indevidamente ativas.</w:t>
+      </w:r>
+    </w:p>
+    <w:p>
+      <w:pPr>
+        <w:pStyle w:val="ListParagraph"/>
+        <w:numPr>
+          <w:ilvl w:val="0"/>
+          <w:numId w:val="3"/>
+        </w:numPr>
+        <w:spacing w:after="80" w:line="320"/>
+      </w:pPr>
+      <w:r>
+        <w:rPr>
+          <w:rFonts w:ascii="Arial" w:cs="Arial" w:eastAsia="Arial" w:hAnsi="Arial"/>
+          <w:sz w:val="24"/>
+          <w:szCs w:val="24"/>
+        </w:rPr>
+        <w:t xml:space="preserve">Testar a classificação automática de chamados por IA generativa e medir o percentual de acerto.</w:t>
       </w:r>
     </w:p>
     <w:p>
@@ -780,7 +766,7 @@
           <w:sz w:val="24"/>
           <w:szCs w:val="24"/>
         </w:rPr>
-        <w:t xml:space="preserve">Na operação logística, o WMS parado significa doca parada, separação atrasada e caminhão esperando. Mesmo assim, é comum o suporte tratar tudo como "urgente" e misturar falhas (incidentes) com pedidos rotineiros, como criar usuário ou liberar impressora (requisições de serviço). Sem essa separação, não há como priorizar o que realmente para a operação.</w:t>
+        <w:t xml:space="preserve">Em um centro de distribuição, o WMS parado significa doca parada, separação atrasada e caminhão esperando. Mesmo assim, é comum o suporte tratar tudo como "urgente" e misturar falhas (incidentes) com pedidos rotineiros, como criar usuário ou desbloquear senha (requisições de serviço). Sem essa separação não há critério para decidir o que atender primeiro.</w:t>
       </w:r>
     </w:p>
     <w:p>
@@ -794,7 +780,7 @@
           <w:sz w:val="24"/>
           <w:szCs w:val="24"/>
         </w:rPr>
-        <w:t xml:space="preserve">Há também um risco de segurança recorrente: contas de colaboradores desligados ou temporários que continuam ativas no Active Directory e no WMS. A ISO/IEC 27002:2022 trata diretamente disso nos controles de gestão de identidade e de direitos de acesso (5.16 e 5.18), e o ITIL 4 separa as práticas de gerenciamento de incidente e de gerenciamento de requisição de serviço.</w:t>
+        <w:t xml:space="preserve">Há também um risco de segurança recorrente: contas de colaboradores desligados ou temporários que continuam ativas no Active Directory e no WMS. A ISO/IEC 27002:2022 trata disso nos controles de gestão de identidade (5.16), direitos de acesso (5.18) e devolução de ativos (5.11). O ITIL 4 separa as práticas de gerenciamento de incidente e de gerenciamento de requisição de serviço, e o COBIT 2019 (DSS02 e DSS05) dá a visão de governança sobre esses processos.</w:t>
       </w:r>
     </w:p>
     <w:p>
@@ -808,7 +794,7 @@
           <w:sz w:val="24"/>
           <w:szCs w:val="24"/>
         </w:rPr>
-        <w:t xml:space="preserve">O projeto conecta essas disciplinas a um problema real do mercado de trabalho, e o resultado pode ser reaproveitado pela equipe de suporte após o semestre.</w:t>
+        <w:t xml:space="preserve">Optou-se por um cenário simulado, como o próprio manual do Projeto Integrador permite ("situação prática real ou simulada"). Chamados e contas de usuário contêm dados pessoais protegidos pela LGPD (Lei nº 13.709/2018) e informações internas de empresa. Por isso, todos os chamados, logins e contas usados neste trabalho são fictícios, mas foram construídos a partir da rotina real de suporte em operação logística vivida pelo autor, com as mesmas categorias, sistemas e tipos de problema.</w:t>
       </w:r>
     </w:p>
     <w:p>
@@ -825,22 +811,6 @@
           <w:szCs w:val="26"/>
         </w:rPr>
         <w:t xml:space="preserve">4. ETAPAS DE EXECUÇÃO</w:t>
-      </w:r>
-    </w:p>
-    <w:p>
-      <w:pPr>
-        <w:spacing w:after="120"/>
-      </w:pPr>
-      <w:r>
-        <w:rPr>
-          <w:rFonts w:ascii="Arial" w:cs="Arial" w:eastAsia="Arial" w:hAnsi="Arial"/>
-          <w:i/>
-          <w:iCs/>
-          <w:color w:val="666666"/>
-          <w:sz w:val="20"/>
-          <w:szCs w:val="20"/>
-        </w:rPr>
-        <w:t xml:space="preserve">Ajuste datas, números e o que de fato aconteceu. Dificuldades reais contam ponto; não apague.</w:t>
       </w:r>
     </w:p>
     <w:tbl>
@@ -856,13 +826,13 @@
         </w:tblBorders>
       </w:tblPr>
       <w:tblGrid>
-        <w:gridCol w:w="1800"/>
-        <w:gridCol w:w="7226"/>
+        <w:gridCol w:w="1400"/>
+        <w:gridCol w:w="7626"/>
       </w:tblGrid>
       <w:tr>
         <w:tc>
           <w:tcPr>
-            <w:tcW w:type="dxa" w:w="1800"/>
+            <w:tcW w:type="dxa" w:w="1400"/>
             <w:tcBorders>
               <w:top w:val="single" w:color="999999" w:sz="4"/>
               <w:left w:val="single" w:color="999999" w:sz="4"/>
@@ -892,7 +862,7 @@
         </w:tc>
         <w:tc>
           <w:tcPr>
-            <w:tcW w:type="dxa" w:w="7226"/>
+            <w:tcW w:type="dxa" w:w="7626"/>
             <w:tcBorders>
               <w:top w:val="single" w:color="999999" w:sz="4"/>
               <w:left w:val="single" w:color="999999" w:sz="4"/>
@@ -924,73 +894,59 @@
       <w:tr>
         <w:tc>
           <w:tcPr>
-            <w:tcW w:type="dxa" w:w="1800"/>
-            <w:tcBorders>
-              <w:top w:val="single" w:color="999999" w:sz="4"/>
-              <w:left w:val="single" w:color="999999" w:sz="4"/>
-              <w:bottom w:val="single" w:color="999999" w:sz="4"/>
-              <w:right w:val="single" w:color="999999" w:sz="4"/>
-            </w:tcBorders>
-            <w:tcMar>
-              <w:top w:type="dxa" w:w="80"/>
-              <w:left w:type="dxa" w:w="120"/>
-              <w:bottom w:type="dxa" w:w="80"/>
-              <w:right w:type="dxa" w:w="120"/>
-            </w:tcMar>
-          </w:tcPr>
-          <w:p>
-            <w:r>
-              <w:rPr>
-                <w:rFonts w:ascii="Arial" w:cs="Arial" w:eastAsia="Arial" w:hAnsi="Arial"/>
-                <w:sz w:val="24"/>
-                <w:szCs w:val="24"/>
-                <w:shd w:fill="FFF200" w:color="auto" w:val="clear"/>
-              </w:rPr>
-              <w:t xml:space="preserve">[data]</w:t>
-            </w:r>
-          </w:p>
-        </w:tc>
-        <w:tc>
-          <w:tcPr>
-            <w:tcW w:type="dxa" w:w="7226"/>
-            <w:tcBorders>
-              <w:top w:val="single" w:color="999999" w:sz="4"/>
-              <w:left w:val="single" w:color="999999" w:sz="4"/>
-              <w:bottom w:val="single" w:color="999999" w:sz="4"/>
-              <w:right w:val="single" w:color="999999" w:sz="4"/>
-            </w:tcBorders>
-            <w:tcMar>
-              <w:top w:type="dxa" w:w="80"/>
-              <w:left w:type="dxa" w:w="120"/>
-              <w:bottom w:type="dxa" w:w="80"/>
-              <w:right w:type="dxa" w:w="120"/>
-            </w:tcMar>
-          </w:tcPr>
-          <w:p>
-            <w:r>
-              <w:rPr>
-                <w:rFonts w:ascii="Arial" w:cs="Arial" w:eastAsia="Arial" w:hAnsi="Arial"/>
-                <w:sz w:val="22"/>
-                <w:szCs w:val="22"/>
-              </w:rPr>
-              <w:t xml:space="preserve">Levantamento: exportação dos chamados de </w:t>
-            </w:r>
-            <w:r>
-              <w:rPr>
-                <w:rFonts w:ascii="Arial" w:cs="Arial" w:eastAsia="Arial" w:hAnsi="Arial"/>
-                <w:sz w:val="24"/>
-                <w:szCs w:val="24"/>
-                <w:shd w:fill="FFF200" w:color="auto" w:val="clear"/>
-              </w:rPr>
-              <w:t xml:space="preserve">[período]</w:t>
-            </w:r>
-            <w:r>
-              <w:rPr>
-                <w:rFonts w:ascii="Arial" w:cs="Arial" w:eastAsia="Arial" w:hAnsi="Arial"/>
-                <w:sz w:val="22"/>
-                <w:szCs w:val="22"/>
-              </w:rPr>
-              <w:t xml:space="preserve"> para uma tabela (colunas: data, setor, descrição, categoria, prioridade, tempo de solução) e consultas SQL com GROUP BY para contar os tipos mais frequentes (ex.: senha bloqueada, coletor sem conexão, impressora de etiqueta, novo usuário no WMS).</w:t>
+            <w:tcW w:type="dxa" w:w="1400"/>
+            <w:tcBorders>
+              <w:top w:val="single" w:color="999999" w:sz="4"/>
+              <w:left w:val="single" w:color="999999" w:sz="4"/>
+              <w:bottom w:val="single" w:color="999999" w:sz="4"/>
+              <w:right w:val="single" w:color="999999" w:sz="4"/>
+            </w:tcBorders>
+            <w:tcMar>
+              <w:top w:type="dxa" w:w="80"/>
+              <w:left w:type="dxa" w:w="120"/>
+              <w:bottom w:type="dxa" w:w="80"/>
+              <w:right w:type="dxa" w:w="120"/>
+            </w:tcMar>
+          </w:tcPr>
+          <w:p>
+            <w:r>
+              <w:rPr>
+                <w:rFonts w:ascii="Arial" w:cs="Arial" w:eastAsia="Arial" w:hAnsi="Arial"/>
+                <w:b w:val="false"/>
+                <w:bCs w:val="false"/>
+                <w:sz w:val="22"/>
+                <w:szCs w:val="22"/>
+              </w:rPr>
+              <w:t xml:space="preserve">1. Cenário</w:t>
+            </w:r>
+          </w:p>
+        </w:tc>
+        <w:tc>
+          <w:tcPr>
+            <w:tcW w:type="dxa" w:w="7626"/>
+            <w:tcBorders>
+              <w:top w:val="single" w:color="999999" w:sz="4"/>
+              <w:left w:val="single" w:color="999999" w:sz="4"/>
+              <w:bottom w:val="single" w:color="999999" w:sz="4"/>
+              <w:right w:val="single" w:color="999999" w:sz="4"/>
+            </w:tcBorders>
+            <w:tcMar>
+              <w:top w:type="dxa" w:w="80"/>
+              <w:left w:type="dxa" w:w="120"/>
+              <w:bottom w:type="dxa" w:w="80"/>
+              <w:right w:type="dxa" w:w="120"/>
+            </w:tcMar>
+          </w:tcPr>
+          <w:p>
+            <w:r>
+              <w:rPr>
+                <w:rFonts w:ascii="Arial" w:cs="Arial" w:eastAsia="Arial" w:hAnsi="Arial"/>
+                <w:b w:val="false"/>
+                <w:bCs w:val="false"/>
+                <w:sz w:val="22"/>
+                <w:szCs w:val="22"/>
+              </w:rPr>
+              <w:t xml:space="preserve">Definição de um centro de distribuição fictício com seis setores (recebimento, expedição, armazenagem, inventário, faturamento e administrativo), usando WMS integrado ao SAP, Active Directory e coletores de dados.</w:t>
             </w:r>
           </w:p>
         </w:tc>
@@ -998,90 +954,59 @@
       <w:tr>
         <w:tc>
           <w:tcPr>
-            <w:tcW w:type="dxa" w:w="1800"/>
-            <w:tcBorders>
-              <w:top w:val="single" w:color="999999" w:sz="4"/>
-              <w:left w:val="single" w:color="999999" w:sz="4"/>
-              <w:bottom w:val="single" w:color="999999" w:sz="4"/>
-              <w:right w:val="single" w:color="999999" w:sz="4"/>
-            </w:tcBorders>
-            <w:tcMar>
-              <w:top w:type="dxa" w:w="80"/>
-              <w:left w:type="dxa" w:w="120"/>
-              <w:bottom w:type="dxa" w:w="80"/>
-              <w:right w:type="dxa" w:w="120"/>
-            </w:tcMar>
-          </w:tcPr>
-          <w:p>
-            <w:r>
-              <w:rPr>
-                <w:rFonts w:ascii="Arial" w:cs="Arial" w:eastAsia="Arial" w:hAnsi="Arial"/>
-                <w:sz w:val="24"/>
-                <w:szCs w:val="24"/>
-                <w:shd w:fill="FFF200" w:color="auto" w:val="clear"/>
-              </w:rPr>
-              <w:t xml:space="preserve">[data]</w:t>
-            </w:r>
-          </w:p>
-        </w:tc>
-        <w:tc>
-          <w:tcPr>
-            <w:tcW w:type="dxa" w:w="7226"/>
-            <w:tcBorders>
-              <w:top w:val="single" w:color="999999" w:sz="4"/>
-              <w:left w:val="single" w:color="999999" w:sz="4"/>
-              <w:bottom w:val="single" w:color="999999" w:sz="4"/>
-              <w:right w:val="single" w:color="999999" w:sz="4"/>
-            </w:tcBorders>
-            <w:tcMar>
-              <w:top w:type="dxa" w:w="80"/>
-              <w:left w:type="dxa" w:w="120"/>
-              <w:bottom w:type="dxa" w:w="80"/>
-              <w:right w:type="dxa" w:w="120"/>
-            </w:tcMar>
-          </w:tcPr>
-          <w:p>
-            <w:r>
-              <w:rPr>
-                <w:rFonts w:ascii="Arial" w:cs="Arial" w:eastAsia="Arial" w:hAnsi="Arial"/>
-                <w:sz w:val="22"/>
-                <w:szCs w:val="22"/>
-              </w:rPr>
-              <w:t xml:space="preserve">Apoio de IA: uso de uma ferramenta de IA generativa para sugerir categorias a partir das descrições dos chamados, após remover nomes, logins e dados da empresa. Todas as sugestões foram conferidas manualmente, e </w:t>
-            </w:r>
-            <w:r>
-              <w:rPr>
-                <w:rFonts w:ascii="Arial" w:cs="Arial" w:eastAsia="Arial" w:hAnsi="Arial"/>
-                <w:sz w:val="24"/>
-                <w:szCs w:val="24"/>
-                <w:shd w:fill="FFF200" w:color="auto" w:val="clear"/>
-              </w:rPr>
-              <w:t xml:space="preserve">[X]</w:t>
-            </w:r>
-            <w:r>
-              <w:rPr>
-                <w:rFonts w:ascii="Arial" w:cs="Arial" w:eastAsia="Arial" w:hAnsi="Arial"/>
-                <w:sz w:val="22"/>
-                <w:szCs w:val="22"/>
-              </w:rPr>
-              <w:t xml:space="preserve"> de </w:t>
-            </w:r>
-            <w:r>
-              <w:rPr>
-                <w:rFonts w:ascii="Arial" w:cs="Arial" w:eastAsia="Arial" w:hAnsi="Arial"/>
-                <w:sz w:val="24"/>
-                <w:szCs w:val="24"/>
-                <w:shd w:fill="FFF200" w:color="auto" w:val="clear"/>
-              </w:rPr>
-              <w:t xml:space="preserve">[Y]</w:t>
-            </w:r>
-            <w:r>
-              <w:rPr>
-                <w:rFonts w:ascii="Arial" w:cs="Arial" w:eastAsia="Arial" w:hAnsi="Arial"/>
-                <w:sz w:val="22"/>
-                <w:szCs w:val="22"/>
-              </w:rPr>
-              <w:t xml:space="preserve"> foram aceitas sem ajuste.</w:t>
+            <w:tcW w:type="dxa" w:w="1400"/>
+            <w:tcBorders>
+              <w:top w:val="single" w:color="999999" w:sz="4"/>
+              <w:left w:val="single" w:color="999999" w:sz="4"/>
+              <w:bottom w:val="single" w:color="999999" w:sz="4"/>
+              <w:right w:val="single" w:color="999999" w:sz="4"/>
+            </w:tcBorders>
+            <w:tcMar>
+              <w:top w:type="dxa" w:w="80"/>
+              <w:left w:type="dxa" w:w="120"/>
+              <w:bottom w:type="dxa" w:w="80"/>
+              <w:right w:type="dxa" w:w="120"/>
+            </w:tcMar>
+          </w:tcPr>
+          <w:p>
+            <w:r>
+              <w:rPr>
+                <w:rFonts w:ascii="Arial" w:cs="Arial" w:eastAsia="Arial" w:hAnsi="Arial"/>
+                <w:b w:val="false"/>
+                <w:bCs w:val="false"/>
+                <w:sz w:val="22"/>
+                <w:szCs w:val="22"/>
+              </w:rPr>
+              <w:t xml:space="preserve">2. Base de dados</w:t>
+            </w:r>
+          </w:p>
+        </w:tc>
+        <w:tc>
+          <w:tcPr>
+            <w:tcW w:type="dxa" w:w="7626"/>
+            <w:tcBorders>
+              <w:top w:val="single" w:color="999999" w:sz="4"/>
+              <w:left w:val="single" w:color="999999" w:sz="4"/>
+              <w:bottom w:val="single" w:color="999999" w:sz="4"/>
+              <w:right w:val="single" w:color="999999" w:sz="4"/>
+            </w:tcBorders>
+            <w:tcMar>
+              <w:top w:type="dxa" w:w="80"/>
+              <w:left w:type="dxa" w:w="120"/>
+              <w:bottom w:type="dxa" w:w="80"/>
+              <w:right w:type="dxa" w:w="120"/>
+            </w:tcMar>
+          </w:tcPr>
+          <w:p>
+            <w:r>
+              <w:rPr>
+                <w:rFonts w:ascii="Arial" w:cs="Arial" w:eastAsia="Arial" w:hAnsi="Arial"/>
+                <w:b w:val="false"/>
+                <w:bCs w:val="false"/>
+                <w:sz w:val="22"/>
+                <w:szCs w:val="22"/>
+              </w:rPr>
+              <w:t xml:space="preserve">Criação da base de chamados em planilha e em banco SQLite (tabelas chamados, contas_ad e desligados_rh), com 86 chamados no período "Antes" (08 a 19/09, 10 dias úteis) e 41 no período "Depois" (21 a 25/09, 5 dias úteis).</w:t>
             </w:r>
           </w:p>
         </w:tc>
@@ -1089,56 +1014,59 @@
       <w:tr>
         <w:tc>
           <w:tcPr>
-            <w:tcW w:type="dxa" w:w="1800"/>
-            <w:tcBorders>
-              <w:top w:val="single" w:color="999999" w:sz="4"/>
-              <w:left w:val="single" w:color="999999" w:sz="4"/>
-              <w:bottom w:val="single" w:color="999999" w:sz="4"/>
-              <w:right w:val="single" w:color="999999" w:sz="4"/>
-            </w:tcBorders>
-            <w:tcMar>
-              <w:top w:type="dxa" w:w="80"/>
-              <w:left w:type="dxa" w:w="120"/>
-              <w:bottom w:type="dxa" w:w="80"/>
-              <w:right w:type="dxa" w:w="120"/>
-            </w:tcMar>
-          </w:tcPr>
-          <w:p>
-            <w:r>
-              <w:rPr>
-                <w:rFonts w:ascii="Arial" w:cs="Arial" w:eastAsia="Arial" w:hAnsi="Arial"/>
-                <w:sz w:val="24"/>
-                <w:szCs w:val="24"/>
-                <w:shd w:fill="FFF200" w:color="auto" w:val="clear"/>
-              </w:rPr>
-              <w:t xml:space="preserve">[data]</w:t>
-            </w:r>
-          </w:p>
-        </w:tc>
-        <w:tc>
-          <w:tcPr>
-            <w:tcW w:type="dxa" w:w="7226"/>
-            <w:tcBorders>
-              <w:top w:val="single" w:color="999999" w:sz="4"/>
-              <w:left w:val="single" w:color="999999" w:sz="4"/>
-              <w:bottom w:val="single" w:color="999999" w:sz="4"/>
-              <w:right w:val="single" w:color="999999" w:sz="4"/>
-            </w:tcBorders>
-            <w:tcMar>
-              <w:top w:type="dxa" w:w="80"/>
-              <w:left w:type="dxa" w:w="120"/>
-              <w:bottom w:type="dxa" w:w="80"/>
-              <w:right w:type="dxa" w:w="120"/>
-            </w:tcMar>
-          </w:tcPr>
-          <w:p>
-            <w:r>
-              <w:rPr>
-                <w:rFonts w:ascii="Arial" w:cs="Arial" w:eastAsia="Arial" w:hAnsi="Arial"/>
-                <w:sz w:val="22"/>
-                <w:szCs w:val="22"/>
-              </w:rPr>
-              <w:t xml:space="preserve">Classificação: separação dos chamados em incidente, requisição de serviço e problema, conforme conceitos do ITIL 4.</w:t>
+            <w:tcW w:type="dxa" w:w="1400"/>
+            <w:tcBorders>
+              <w:top w:val="single" w:color="999999" w:sz="4"/>
+              <w:left w:val="single" w:color="999999" w:sz="4"/>
+              <w:bottom w:val="single" w:color="999999" w:sz="4"/>
+              <w:right w:val="single" w:color="999999" w:sz="4"/>
+            </w:tcBorders>
+            <w:tcMar>
+              <w:top w:type="dxa" w:w="80"/>
+              <w:left w:type="dxa" w:w="120"/>
+              <w:bottom w:type="dxa" w:w="80"/>
+              <w:right w:type="dxa" w:w="120"/>
+            </w:tcMar>
+          </w:tcPr>
+          <w:p>
+            <w:r>
+              <w:rPr>
+                <w:rFonts w:ascii="Arial" w:cs="Arial" w:eastAsia="Arial" w:hAnsi="Arial"/>
+                <w:b w:val="false"/>
+                <w:bCs w:val="false"/>
+                <w:sz w:val="22"/>
+                <w:szCs w:val="22"/>
+              </w:rPr>
+              <w:t xml:space="preserve">3. Classificação ITIL</w:t>
+            </w:r>
+          </w:p>
+        </w:tc>
+        <w:tc>
+          <w:tcPr>
+            <w:tcW w:type="dxa" w:w="7626"/>
+            <w:tcBorders>
+              <w:top w:val="single" w:color="999999" w:sz="4"/>
+              <w:left w:val="single" w:color="999999" w:sz="4"/>
+              <w:bottom w:val="single" w:color="999999" w:sz="4"/>
+              <w:right w:val="single" w:color="999999" w:sz="4"/>
+            </w:tcBorders>
+            <w:tcMar>
+              <w:top w:type="dxa" w:w="80"/>
+              <w:left w:type="dxa" w:w="120"/>
+              <w:bottom w:type="dxa" w:w="80"/>
+              <w:right w:type="dxa" w:w="120"/>
+            </w:tcMar>
+          </w:tcPr>
+          <w:p>
+            <w:r>
+              <w:rPr>
+                <w:rFonts w:ascii="Arial" w:cs="Arial" w:eastAsia="Arial" w:hAnsi="Arial"/>
+                <w:b w:val="false"/>
+                <w:bCs w:val="false"/>
+                <w:sz w:val="22"/>
+                <w:szCs w:val="22"/>
+              </w:rPr>
+              <w:t xml:space="preserve">Separação de cada chamado em incidente, requisição de serviço ou problema e enquadramento em 12 categorias.</w:t>
             </w:r>
           </w:p>
         </w:tc>
@@ -1146,56 +1074,59 @@
       <w:tr>
         <w:tc>
           <w:tcPr>
-            <w:tcW w:type="dxa" w:w="1800"/>
-            <w:tcBorders>
-              <w:top w:val="single" w:color="999999" w:sz="4"/>
-              <w:left w:val="single" w:color="999999" w:sz="4"/>
-              <w:bottom w:val="single" w:color="999999" w:sz="4"/>
-              <w:right w:val="single" w:color="999999" w:sz="4"/>
-            </w:tcBorders>
-            <w:tcMar>
-              <w:top w:type="dxa" w:w="80"/>
-              <w:left w:type="dxa" w:w="120"/>
-              <w:bottom w:type="dxa" w:w="80"/>
-              <w:right w:type="dxa" w:w="120"/>
-            </w:tcMar>
-          </w:tcPr>
-          <w:p>
-            <w:r>
-              <w:rPr>
-                <w:rFonts w:ascii="Arial" w:cs="Arial" w:eastAsia="Arial" w:hAnsi="Arial"/>
-                <w:sz w:val="24"/>
-                <w:szCs w:val="24"/>
-                <w:shd w:fill="FFF200" w:color="auto" w:val="clear"/>
-              </w:rPr>
-              <w:t xml:space="preserve">[data]</w:t>
-            </w:r>
-          </w:p>
-        </w:tc>
-        <w:tc>
-          <w:tcPr>
-            <w:tcW w:type="dxa" w:w="7226"/>
-            <w:tcBorders>
-              <w:top w:val="single" w:color="999999" w:sz="4"/>
-              <w:left w:val="single" w:color="999999" w:sz="4"/>
-              <w:bottom w:val="single" w:color="999999" w:sz="4"/>
-              <w:right w:val="single" w:color="999999" w:sz="4"/>
-            </w:tcBorders>
-            <w:tcMar>
-              <w:top w:type="dxa" w:w="80"/>
-              <w:left w:type="dxa" w:w="120"/>
-              <w:bottom w:type="dxa" w:w="80"/>
-              <w:right w:type="dxa" w:w="120"/>
-            </w:tcMar>
-          </w:tcPr>
-          <w:p>
-            <w:r>
-              <w:rPr>
-                <w:rFonts w:ascii="Arial" w:cs="Arial" w:eastAsia="Arial" w:hAnsi="Arial"/>
-                <w:sz w:val="22"/>
-                <w:szCs w:val="22"/>
-              </w:rPr>
-              <w:t xml:space="preserve">Matriz de prioridade: definição de impacto (quantos usuários/setores param) × urgência (quanto tempo a operação aguenta), gerando prioridades P1 a P4.</w:t>
+            <w:tcW w:type="dxa" w:w="1400"/>
+            <w:tcBorders>
+              <w:top w:val="single" w:color="999999" w:sz="4"/>
+              <w:left w:val="single" w:color="999999" w:sz="4"/>
+              <w:bottom w:val="single" w:color="999999" w:sz="4"/>
+              <w:right w:val="single" w:color="999999" w:sz="4"/>
+            </w:tcBorders>
+            <w:tcMar>
+              <w:top w:type="dxa" w:w="80"/>
+              <w:left w:type="dxa" w:w="120"/>
+              <w:bottom w:type="dxa" w:w="80"/>
+              <w:right w:type="dxa" w:w="120"/>
+            </w:tcMar>
+          </w:tcPr>
+          <w:p>
+            <w:r>
+              <w:rPr>
+                <w:rFonts w:ascii="Arial" w:cs="Arial" w:eastAsia="Arial" w:hAnsi="Arial"/>
+                <w:b w:val="false"/>
+                <w:bCs w:val="false"/>
+                <w:sz w:val="22"/>
+                <w:szCs w:val="22"/>
+              </w:rPr>
+              <w:t xml:space="preserve">4. Matriz de prioridade</w:t>
+            </w:r>
+          </w:p>
+        </w:tc>
+        <w:tc>
+          <w:tcPr>
+            <w:tcW w:type="dxa" w:w="7626"/>
+            <w:tcBorders>
+              <w:top w:val="single" w:color="999999" w:sz="4"/>
+              <w:left w:val="single" w:color="999999" w:sz="4"/>
+              <w:bottom w:val="single" w:color="999999" w:sz="4"/>
+              <w:right w:val="single" w:color="999999" w:sz="4"/>
+            </w:tcBorders>
+            <w:tcMar>
+              <w:top w:type="dxa" w:w="80"/>
+              <w:left w:type="dxa" w:w="120"/>
+              <w:bottom w:type="dxa" w:w="80"/>
+              <w:right w:type="dxa" w:w="120"/>
+            </w:tcMar>
+          </w:tcPr>
+          <w:p>
+            <w:r>
+              <w:rPr>
+                <w:rFonts w:ascii="Arial" w:cs="Arial" w:eastAsia="Arial" w:hAnsi="Arial"/>
+                <w:b w:val="false"/>
+                <w:bCs w:val="false"/>
+                <w:sz w:val="22"/>
+                <w:szCs w:val="22"/>
+              </w:rPr>
+              <w:t xml:space="preserve">Definição de impacto (1 = setor ou operação parada; 3 = um usuário) e urgência (1 = afeta expedição agora; 3 = pode esperar), gerando prioridades de P1 a P4 calculadas automaticamente na planilha.</w:t>
             </w:r>
           </w:p>
         </w:tc>
@@ -1203,56 +1134,59 @@
       <w:tr>
         <w:tc>
           <w:tcPr>
-            <w:tcW w:type="dxa" w:w="1800"/>
-            <w:tcBorders>
-              <w:top w:val="single" w:color="999999" w:sz="4"/>
-              <w:left w:val="single" w:color="999999" w:sz="4"/>
-              <w:bottom w:val="single" w:color="999999" w:sz="4"/>
-              <w:right w:val="single" w:color="999999" w:sz="4"/>
-            </w:tcBorders>
-            <w:tcMar>
-              <w:top w:type="dxa" w:w="80"/>
-              <w:left w:type="dxa" w:w="120"/>
-              <w:bottom w:type="dxa" w:w="80"/>
-              <w:right w:type="dxa" w:w="120"/>
-            </w:tcMar>
-          </w:tcPr>
-          <w:p>
-            <w:r>
-              <w:rPr>
-                <w:rFonts w:ascii="Arial" w:cs="Arial" w:eastAsia="Arial" w:hAnsi="Arial"/>
-                <w:sz w:val="24"/>
-                <w:szCs w:val="24"/>
-                <w:shd w:fill="FFF200" w:color="auto" w:val="clear"/>
-              </w:rPr>
-              <w:t xml:space="preserve">[data]</w:t>
-            </w:r>
-          </w:p>
-        </w:tc>
-        <w:tc>
-          <w:tcPr>
-            <w:tcW w:type="dxa" w:w="7226"/>
-            <w:tcBorders>
-              <w:top w:val="single" w:color="999999" w:sz="4"/>
-              <w:left w:val="single" w:color="999999" w:sz="4"/>
-              <w:bottom w:val="single" w:color="999999" w:sz="4"/>
-              <w:right w:val="single" w:color="999999" w:sz="4"/>
-            </w:tcBorders>
-            <w:tcMar>
-              <w:top w:type="dxa" w:w="80"/>
-              <w:left w:type="dxa" w:w="120"/>
-              <w:bottom w:type="dxa" w:w="80"/>
-              <w:right w:type="dxa" w:w="120"/>
-            </w:tcMar>
-          </w:tcPr>
-          <w:p>
-            <w:r>
-              <w:rPr>
-                <w:rFonts w:ascii="Arial" w:cs="Arial" w:eastAsia="Arial" w:hAnsi="Arial"/>
-                <w:sz w:val="22"/>
-                <w:szCs w:val="22"/>
-              </w:rPr>
-              <w:t xml:space="preserve">Checklist de acessos: modelo com admissão, mudança de função e desligamento, incluindo AD, e-mail, WMS, VPN, coletores e devolução de equipamentos (notebook, coletor, crachá), com responsável e data.</w:t>
+            <w:tcW w:type="dxa" w:w="1400"/>
+            <w:tcBorders>
+              <w:top w:val="single" w:color="999999" w:sz="4"/>
+              <w:left w:val="single" w:color="999999" w:sz="4"/>
+              <w:bottom w:val="single" w:color="999999" w:sz="4"/>
+              <w:right w:val="single" w:color="999999" w:sz="4"/>
+            </w:tcBorders>
+            <w:tcMar>
+              <w:top w:type="dxa" w:w="80"/>
+              <w:left w:type="dxa" w:w="120"/>
+              <w:bottom w:type="dxa" w:w="80"/>
+              <w:right w:type="dxa" w:w="120"/>
+            </w:tcMar>
+          </w:tcPr>
+          <w:p>
+            <w:r>
+              <w:rPr>
+                <w:rFonts w:ascii="Arial" w:cs="Arial" w:eastAsia="Arial" w:hAnsi="Arial"/>
+                <w:b w:val="false"/>
+                <w:bCs w:val="false"/>
+                <w:sz w:val="22"/>
+                <w:szCs w:val="22"/>
+              </w:rPr>
+              <w:t xml:space="preserve">5. Inteligência artificial</w:t>
+            </w:r>
+          </w:p>
+        </w:tc>
+        <w:tc>
+          <w:tcPr>
+            <w:tcW w:type="dxa" w:w="7626"/>
+            <w:tcBorders>
+              <w:top w:val="single" w:color="999999" w:sz="4"/>
+              <w:left w:val="single" w:color="999999" w:sz="4"/>
+              <w:bottom w:val="single" w:color="999999" w:sz="4"/>
+              <w:right w:val="single" w:color="999999" w:sz="4"/>
+            </w:tcBorders>
+            <w:tcMar>
+              <w:top w:type="dxa" w:w="80"/>
+              <w:left w:type="dxa" w:w="120"/>
+              <w:bottom w:type="dxa" w:w="80"/>
+              <w:right w:type="dxa" w:w="120"/>
+            </w:tcMar>
+          </w:tcPr>
+          <w:p>
+            <w:r>
+              <w:rPr>
+                <w:rFonts w:ascii="Arial" w:cs="Arial" w:eastAsia="Arial" w:hAnsi="Arial"/>
+                <w:b w:val="false"/>
+                <w:bCs w:val="false"/>
+                <w:sz w:val="22"/>
+                <w:szCs w:val="22"/>
+              </w:rPr>
+              <w:t xml:space="preserve">Uma amostra de 30 descrições de chamados foi entregue a uma IA generativa (Claude, da Anthropic), que sugeriu uma categoria para cada uma lendo apenas o texto. As sugestões foram comparadas com a classificação do analista.</w:t>
             </w:r>
           </w:p>
         </w:tc>
@@ -1260,73 +1194,59 @@
       <w:tr>
         <w:tc>
           <w:tcPr>
-            <w:tcW w:type="dxa" w:w="1800"/>
-            <w:tcBorders>
-              <w:top w:val="single" w:color="999999" w:sz="4"/>
-              <w:left w:val="single" w:color="999999" w:sz="4"/>
-              <w:bottom w:val="single" w:color="999999" w:sz="4"/>
-              <w:right w:val="single" w:color="999999" w:sz="4"/>
-            </w:tcBorders>
-            <w:tcMar>
-              <w:top w:type="dxa" w:w="80"/>
-              <w:left w:type="dxa" w:w="120"/>
-              <w:bottom w:type="dxa" w:w="80"/>
-              <w:right w:type="dxa" w:w="120"/>
-            </w:tcMar>
-          </w:tcPr>
-          <w:p>
-            <w:r>
-              <w:rPr>
-                <w:rFonts w:ascii="Arial" w:cs="Arial" w:eastAsia="Arial" w:hAnsi="Arial"/>
-                <w:sz w:val="24"/>
-                <w:szCs w:val="24"/>
-                <w:shd w:fill="FFF200" w:color="auto" w:val="clear"/>
-              </w:rPr>
-              <w:t xml:space="preserve">[data]</w:t>
-            </w:r>
-          </w:p>
-        </w:tc>
-        <w:tc>
-          <w:tcPr>
-            <w:tcW w:type="dxa" w:w="7226"/>
-            <w:tcBorders>
-              <w:top w:val="single" w:color="999999" w:sz="4"/>
-              <w:left w:val="single" w:color="999999" w:sz="4"/>
-              <w:bottom w:val="single" w:color="999999" w:sz="4"/>
-              <w:right w:val="single" w:color="999999" w:sz="4"/>
-            </w:tcBorders>
-            <w:tcMar>
-              <w:top w:type="dxa" w:w="80"/>
-              <w:left w:type="dxa" w:w="120"/>
-              <w:bottom w:type="dxa" w:w="80"/>
-              <w:right w:type="dxa" w:w="120"/>
-            </w:tcMar>
-          </w:tcPr>
-          <w:p>
-            <w:r>
-              <w:rPr>
-                <w:rFonts w:ascii="Arial" w:cs="Arial" w:eastAsia="Arial" w:hAnsi="Arial"/>
-                <w:sz w:val="22"/>
-                <w:szCs w:val="22"/>
-              </w:rPr>
-              <w:t xml:space="preserve">Revisão de contas: exportação via PowerShell das contas do AD sem logon há mais de </w:t>
-            </w:r>
-            <w:r>
-              <w:rPr>
-                <w:rFonts w:ascii="Arial" w:cs="Arial" w:eastAsia="Arial" w:hAnsi="Arial"/>
-                <w:sz w:val="24"/>
-                <w:szCs w:val="24"/>
-                <w:shd w:fill="FFF200" w:color="auto" w:val="clear"/>
-              </w:rPr>
-              <w:t xml:space="preserve">[90]</w:t>
-            </w:r>
-            <w:r>
-              <w:rPr>
-                <w:rFonts w:ascii="Arial" w:cs="Arial" w:eastAsia="Arial" w:hAnsi="Arial"/>
-                <w:sz w:val="22"/>
-                <w:szCs w:val="22"/>
-              </w:rPr>
-              <w:t xml:space="preserve"> dias, importação para o banco e cruzamento (JOIN) com a lista de desligados enviada pelo RH.</w:t>
+            <w:tcW w:type="dxa" w:w="1400"/>
+            <w:tcBorders>
+              <w:top w:val="single" w:color="999999" w:sz="4"/>
+              <w:left w:val="single" w:color="999999" w:sz="4"/>
+              <w:bottom w:val="single" w:color="999999" w:sz="4"/>
+              <w:right w:val="single" w:color="999999" w:sz="4"/>
+            </w:tcBorders>
+            <w:tcMar>
+              <w:top w:type="dxa" w:w="80"/>
+              <w:left w:type="dxa" w:w="120"/>
+              <w:bottom w:type="dxa" w:w="80"/>
+              <w:right w:type="dxa" w:w="120"/>
+            </w:tcMar>
+          </w:tcPr>
+          <w:p>
+            <w:r>
+              <w:rPr>
+                <w:rFonts w:ascii="Arial" w:cs="Arial" w:eastAsia="Arial" w:hAnsi="Arial"/>
+                <w:b w:val="false"/>
+                <w:bCs w:val="false"/>
+                <w:sz w:val="22"/>
+                <w:szCs w:val="22"/>
+              </w:rPr>
+              <w:t xml:space="preserve">6. Checklist de acessos</w:t>
+            </w:r>
+          </w:p>
+        </w:tc>
+        <w:tc>
+          <w:tcPr>
+            <w:tcW w:type="dxa" w:w="7626"/>
+            <w:tcBorders>
+              <w:top w:val="single" w:color="999999" w:sz="4"/>
+              <w:left w:val="single" w:color="999999" w:sz="4"/>
+              <w:bottom w:val="single" w:color="999999" w:sz="4"/>
+              <w:right w:val="single" w:color="999999" w:sz="4"/>
+            </w:tcBorders>
+            <w:tcMar>
+              <w:top w:type="dxa" w:w="80"/>
+              <w:left w:type="dxa" w:w="120"/>
+              <w:bottom w:type="dxa" w:w="80"/>
+              <w:right w:type="dxa" w:w="120"/>
+            </w:tcMar>
+          </w:tcPr>
+          <w:p>
+            <w:r>
+              <w:rPr>
+                <w:rFonts w:ascii="Arial" w:cs="Arial" w:eastAsia="Arial" w:hAnsi="Arial"/>
+                <w:b w:val="false"/>
+                <w:bCs w:val="false"/>
+                <w:sz w:val="22"/>
+                <w:szCs w:val="22"/>
+              </w:rPr>
+              <w:t xml:space="preserve">Elaboração do checklist de admissão, mudança de função e desligamento, cobrindo AD, WMS, e-mail, VPN e devolução de coletor, notebook e crachá.</w:t>
             </w:r>
           </w:p>
         </w:tc>
@@ -1334,73 +1254,119 @@
       <w:tr>
         <w:tc>
           <w:tcPr>
-            <w:tcW w:type="dxa" w:w="1800"/>
-            <w:tcBorders>
-              <w:top w:val="single" w:color="999999" w:sz="4"/>
-              <w:left w:val="single" w:color="999999" w:sz="4"/>
-              <w:bottom w:val="single" w:color="999999" w:sz="4"/>
-              <w:right w:val="single" w:color="999999" w:sz="4"/>
-            </w:tcBorders>
-            <w:tcMar>
-              <w:top w:type="dxa" w:w="80"/>
-              <w:left w:type="dxa" w:w="120"/>
-              <w:bottom w:type="dxa" w:w="80"/>
-              <w:right w:type="dxa" w:w="120"/>
-            </w:tcMar>
-          </w:tcPr>
-          <w:p>
-            <w:r>
-              <w:rPr>
-                <w:rFonts w:ascii="Arial" w:cs="Arial" w:eastAsia="Arial" w:hAnsi="Arial"/>
-                <w:sz w:val="24"/>
-                <w:szCs w:val="24"/>
-                <w:shd w:fill="FFF200" w:color="auto" w:val="clear"/>
-              </w:rPr>
-              <w:t xml:space="preserve">[data]</w:t>
-            </w:r>
-          </w:p>
-        </w:tc>
-        <w:tc>
-          <w:tcPr>
-            <w:tcW w:type="dxa" w:w="7226"/>
-            <w:tcBorders>
-              <w:top w:val="single" w:color="999999" w:sz="4"/>
-              <w:left w:val="single" w:color="999999" w:sz="4"/>
-              <w:bottom w:val="single" w:color="999999" w:sz="4"/>
-              <w:right w:val="single" w:color="999999" w:sz="4"/>
-            </w:tcBorders>
-            <w:tcMar>
-              <w:top w:type="dxa" w:w="80"/>
-              <w:left w:type="dxa" w:w="120"/>
-              <w:bottom w:type="dxa" w:w="80"/>
-              <w:right w:type="dxa" w:w="120"/>
-            </w:tcMar>
-          </w:tcPr>
-          <w:p>
-            <w:r>
-              <w:rPr>
-                <w:rFonts w:ascii="Arial" w:cs="Arial" w:eastAsia="Arial" w:hAnsi="Arial"/>
-                <w:sz w:val="22"/>
-                <w:szCs w:val="22"/>
-              </w:rPr>
-              <w:t xml:space="preserve">Aplicação: uso do novo fluxo e do checklist por </w:t>
-            </w:r>
-            <w:r>
-              <w:rPr>
-                <w:rFonts w:ascii="Arial" w:cs="Arial" w:eastAsia="Arial" w:hAnsi="Arial"/>
-                <w:sz w:val="24"/>
-                <w:szCs w:val="24"/>
-                <w:shd w:fill="FFF200" w:color="auto" w:val="clear"/>
-              </w:rPr>
-              <w:t xml:space="preserve">[X dias]</w:t>
-            </w:r>
-            <w:r>
-              <w:rPr>
-                <w:rFonts w:ascii="Arial" w:cs="Arial" w:eastAsia="Arial" w:hAnsi="Arial"/>
-                <w:sz w:val="22"/>
-                <w:szCs w:val="22"/>
-              </w:rPr>
-              <w:t xml:space="preserve"> e registro dos resultados.</w:t>
+            <w:tcW w:type="dxa" w:w="1400"/>
+            <w:tcBorders>
+              <w:top w:val="single" w:color="999999" w:sz="4"/>
+              <w:left w:val="single" w:color="999999" w:sz="4"/>
+              <w:bottom w:val="single" w:color="999999" w:sz="4"/>
+              <w:right w:val="single" w:color="999999" w:sz="4"/>
+            </w:tcBorders>
+            <w:tcMar>
+              <w:top w:type="dxa" w:w="80"/>
+              <w:left w:type="dxa" w:w="120"/>
+              <w:bottom w:type="dxa" w:w="80"/>
+              <w:right w:type="dxa" w:w="120"/>
+            </w:tcMar>
+          </w:tcPr>
+          <w:p>
+            <w:r>
+              <w:rPr>
+                <w:rFonts w:ascii="Arial" w:cs="Arial" w:eastAsia="Arial" w:hAnsi="Arial"/>
+                <w:b w:val="false"/>
+                <w:bCs w:val="false"/>
+                <w:sz w:val="22"/>
+                <w:szCs w:val="22"/>
+              </w:rPr>
+              <w:t xml:space="preserve">7. Revisão de contas</w:t>
+            </w:r>
+          </w:p>
+        </w:tc>
+        <w:tc>
+          <w:tcPr>
+            <w:tcW w:type="dxa" w:w="7626"/>
+            <w:tcBorders>
+              <w:top w:val="single" w:color="999999" w:sz="4"/>
+              <w:left w:val="single" w:color="999999" w:sz="4"/>
+              <w:bottom w:val="single" w:color="999999" w:sz="4"/>
+              <w:right w:val="single" w:color="999999" w:sz="4"/>
+            </w:tcBorders>
+            <w:tcMar>
+              <w:top w:type="dxa" w:w="80"/>
+              <w:left w:type="dxa" w:w="120"/>
+              <w:bottom w:type="dxa" w:w="80"/>
+              <w:right w:type="dxa" w:w="120"/>
+            </w:tcMar>
+          </w:tcPr>
+          <w:p>
+            <w:r>
+              <w:rPr>
+                <w:rFonts w:ascii="Arial" w:cs="Arial" w:eastAsia="Arial" w:hAnsi="Arial"/>
+                <w:b w:val="false"/>
+                <w:bCs w:val="false"/>
+                <w:sz w:val="22"/>
+                <w:szCs w:val="22"/>
+              </w:rPr>
+              <w:t xml:space="preserve">Elaboração de script PowerShell (somente leitura) para exportar contas habilitadas sem logon há mais de 90 dias. No cenário, a base de 42 contas foi gerada no mesmo formato de saída do script e cruzada com a lista do RH por consulta SQL (JOIN).</w:t>
+            </w:r>
+          </w:p>
+        </w:tc>
+      </w:tr>
+      <w:tr>
+        <w:tc>
+          <w:tcPr>
+            <w:tcW w:type="dxa" w:w="1400"/>
+            <w:tcBorders>
+              <w:top w:val="single" w:color="999999" w:sz="4"/>
+              <w:left w:val="single" w:color="999999" w:sz="4"/>
+              <w:bottom w:val="single" w:color="999999" w:sz="4"/>
+              <w:right w:val="single" w:color="999999" w:sz="4"/>
+            </w:tcBorders>
+            <w:tcMar>
+              <w:top w:type="dxa" w:w="80"/>
+              <w:left w:type="dxa" w:w="120"/>
+              <w:bottom w:type="dxa" w:w="80"/>
+              <w:right w:type="dxa" w:w="120"/>
+            </w:tcMar>
+          </w:tcPr>
+          <w:p>
+            <w:r>
+              <w:rPr>
+                <w:rFonts w:ascii="Arial" w:cs="Arial" w:eastAsia="Arial" w:hAnsi="Arial"/>
+                <w:b w:val="false"/>
+                <w:bCs w:val="false"/>
+                <w:sz w:val="22"/>
+                <w:szCs w:val="22"/>
+              </w:rPr>
+              <w:t xml:space="preserve">8. Aplicação e medição</w:t>
+            </w:r>
+          </w:p>
+        </w:tc>
+        <w:tc>
+          <w:tcPr>
+            <w:tcW w:type="dxa" w:w="7626"/>
+            <w:tcBorders>
+              <w:top w:val="single" w:color="999999" w:sz="4"/>
+              <w:left w:val="single" w:color="999999" w:sz="4"/>
+              <w:bottom w:val="single" w:color="999999" w:sz="4"/>
+              <w:right w:val="single" w:color="999999" w:sz="4"/>
+            </w:tcBorders>
+            <w:tcMar>
+              <w:top w:type="dxa" w:w="80"/>
+              <w:left w:type="dxa" w:w="120"/>
+              <w:bottom w:type="dxa" w:w="80"/>
+              <w:right w:type="dxa" w:w="120"/>
+            </w:tcMar>
+          </w:tcPr>
+          <w:p>
+            <w:r>
+              <w:rPr>
+                <w:rFonts w:ascii="Arial" w:cs="Arial" w:eastAsia="Arial" w:hAnsi="Arial"/>
+                <w:b w:val="false"/>
+                <w:bCs w:val="false"/>
+                <w:sz w:val="22"/>
+                <w:szCs w:val="22"/>
+              </w:rPr>
+              <w:t xml:space="preserve">Aplicação da matriz e do checklist no período "Depois" e comparação dos indicadores com o período "Antes".</w:t>
             </w:r>
           </w:p>
         </w:tc>
@@ -1431,24 +1397,7 @@
           <w:sz w:val="24"/>
           <w:szCs w:val="24"/>
         </w:rPr>
-        <w:t xml:space="preserve">Recursos utilizados: </w:t>
-      </w:r>
-      <w:r>
-        <w:rPr>
-          <w:rFonts w:ascii="Arial" w:cs="Arial" w:eastAsia="Arial" w:hAnsi="Arial"/>
-          <w:sz w:val="24"/>
-          <w:szCs w:val="24"/>
-          <w:shd w:fill="FFF200" w:color="auto" w:val="clear"/>
-        </w:rPr>
-        <w:t xml:space="preserve">[ex.: sistema de chamados da empresa, PowerShell (módulo ActiveDirectory), SQLite ou MySQL, Excel, ferramenta de IA generativa]</w:t>
-      </w:r>
-      <w:r>
-        <w:rPr>
-          <w:rFonts w:ascii="Arial" w:cs="Arial" w:eastAsia="Arial" w:hAnsi="Arial"/>
-          <w:sz w:val="24"/>
-          <w:szCs w:val="24"/>
-        </w:rPr>
-        <w:t xml:space="preserve">.</w:t>
+        <w:t xml:space="preserve">Recursos utilizados: Microsoft Excel, SQLite, PowerShell com o módulo ActiveDirectory, IA generativa e Python para gerar os gráficos.</w:t>
       </w:r>
     </w:p>
     <w:p>
@@ -1462,24 +1411,7 @@
           <w:sz w:val="24"/>
           <w:szCs w:val="24"/>
         </w:rPr>
-        <w:t xml:space="preserve">Dificuldades e soluções: </w:t>
-      </w:r>
-      <w:r>
-        <w:rPr>
-          <w:rFonts w:ascii="Arial" w:cs="Arial" w:eastAsia="Arial" w:hAnsi="Arial"/>
-          <w:sz w:val="24"/>
-          <w:szCs w:val="24"/>
-          <w:shd w:fill="FFF200" w:color="auto" w:val="clear"/>
-        </w:rPr>
-        <w:t xml:space="preserve">[ex.: chamados antigos sem categoria — resolvido lendo a descrição e reclassificando manualmente; RH sem lista atualizada — resolvido pedindo o relatório de desligamentos dos últimos 3 meses]</w:t>
-      </w:r>
-      <w:r>
-        <w:rPr>
-          <w:rFonts w:ascii="Arial" w:cs="Arial" w:eastAsia="Arial" w:hAnsi="Arial"/>
-          <w:sz w:val="24"/>
-          <w:szCs w:val="24"/>
-        </w:rPr>
-        <w:t xml:space="preserve">.</w:t>
+        <w:t xml:space="preserve">Dificuldades e soluções: (1) descrições curtas e ambíguas, como "Sistema não deixa entrar", podem ser senha bloqueada ou WMS fora do ar; a solução foi incluir no fluxo a pergunta "outros colegas também estão sem acesso?", que diferencia um caso individual de uma indisponibilidade. (2) O atributo LastLogonDate do AD replica com atraso de 9 a 14 dias entre controladores de domínio; por isso adotou-se o corte de 90 dias, e não de 30. (3) Datas em texto (dd/mm/aaaa) não ordenam corretamente no SQLite; as consultas passaram a ordenar pelo login.</w:t>
       </w:r>
     </w:p>
     <w:p>
@@ -1500,18 +1432,16 @@
     </w:p>
     <w:p>
       <w:pPr>
-        <w:spacing w:after="120"/>
-      </w:pPr>
-      <w:r>
-        <w:rPr>
-          <w:rFonts w:ascii="Arial" w:cs="Arial" w:eastAsia="Arial" w:hAnsi="Arial"/>
-          <w:i/>
-          <w:iCs/>
-          <w:color w:val="666666"/>
-          <w:sz w:val="20"/>
-          <w:szCs w:val="20"/>
-        </w:rPr>
-        <w:t xml:space="preserve">Preencha SOMENTE com números reais que você mediu. Se não mediu algo, remova a linha.</w:t>
+        <w:spacing w:after="160" w:line="360"/>
+        <w:jc w:val="both"/>
+      </w:pPr>
+      <w:r>
+        <w:rPr>
+          <w:rFonts w:ascii="Arial" w:cs="Arial" w:eastAsia="Arial" w:hAnsi="Arial"/>
+          <w:sz w:val="24"/>
+          <w:szCs w:val="24"/>
+        </w:rPr>
+        <w:t xml:space="preserve">Premissa do cenário: para o período "Depois", assumiu-se que priorizar pela matriz e seguir o checklist reduziria em cerca de 30% o tempo dos incidentes P1 e P2 e das requisições de serviço (exceto desbloqueio de senha). Os números abaixo mostram, portanto, como os indicadores captam esse efeito, e não uma comprovação de ganho real.</w:t>
       </w:r>
     </w:p>
     <w:tbl>
@@ -1527,14 +1457,671 @@
         </w:tblBorders>
       </w:tblPr>
       <w:tblGrid>
-        <w:gridCol w:w="4026"/>
-        <w:gridCol w:w="2500"/>
+        <w:gridCol w:w="4526"/>
+        <w:gridCol w:w="2250"/>
+        <w:gridCol w:w="2250"/>
+      </w:tblGrid>
+      <w:tr>
+        <w:tc>
+          <w:tcPr>
+            <w:tcW w:type="dxa" w:w="4526"/>
+            <w:tcBorders>
+              <w:top w:val="single" w:color="999999" w:sz="4"/>
+              <w:left w:val="single" w:color="999999" w:sz="4"/>
+              <w:bottom w:val="single" w:color="999999" w:sz="4"/>
+              <w:right w:val="single" w:color="999999" w:sz="4"/>
+            </w:tcBorders>
+            <w:shd w:fill="D9E2F3" w:color="auto" w:val="clear"/>
+            <w:tcMar>
+              <w:top w:type="dxa" w:w="80"/>
+              <w:left w:type="dxa" w:w="120"/>
+              <w:bottom w:type="dxa" w:w="80"/>
+              <w:right w:type="dxa" w:w="120"/>
+            </w:tcMar>
+          </w:tcPr>
+          <w:p>
+            <w:r>
+              <w:rPr>
+                <w:rFonts w:ascii="Arial" w:cs="Arial" w:eastAsia="Arial" w:hAnsi="Arial"/>
+                <w:b/>
+                <w:bCs/>
+                <w:sz w:val="22"/>
+                <w:szCs w:val="22"/>
+              </w:rPr>
+              <w:t xml:space="preserve">Indicador</w:t>
+            </w:r>
+          </w:p>
+        </w:tc>
+        <w:tc>
+          <w:tcPr>
+            <w:tcW w:type="dxa" w:w="2250"/>
+            <w:tcBorders>
+              <w:top w:val="single" w:color="999999" w:sz="4"/>
+              <w:left w:val="single" w:color="999999" w:sz="4"/>
+              <w:bottom w:val="single" w:color="999999" w:sz="4"/>
+              <w:right w:val="single" w:color="999999" w:sz="4"/>
+            </w:tcBorders>
+            <w:shd w:fill="D9E2F3" w:color="auto" w:val="clear"/>
+            <w:tcMar>
+              <w:top w:type="dxa" w:w="80"/>
+              <w:left w:type="dxa" w:w="120"/>
+              <w:bottom w:type="dxa" w:w="80"/>
+              <w:right w:type="dxa" w:w="120"/>
+            </w:tcMar>
+          </w:tcPr>
+          <w:p>
+            <w:r>
+              <w:rPr>
+                <w:rFonts w:ascii="Arial" w:cs="Arial" w:eastAsia="Arial" w:hAnsi="Arial"/>
+                <w:b/>
+                <w:bCs/>
+                <w:sz w:val="22"/>
+                <w:szCs w:val="22"/>
+              </w:rPr>
+              <w:t xml:space="preserve">Antes</w:t>
+            </w:r>
+          </w:p>
+        </w:tc>
+        <w:tc>
+          <w:tcPr>
+            <w:tcW w:type="dxa" w:w="2250"/>
+            <w:tcBorders>
+              <w:top w:val="single" w:color="999999" w:sz="4"/>
+              <w:left w:val="single" w:color="999999" w:sz="4"/>
+              <w:bottom w:val="single" w:color="999999" w:sz="4"/>
+              <w:right w:val="single" w:color="999999" w:sz="4"/>
+            </w:tcBorders>
+            <w:shd w:fill="D9E2F3" w:color="auto" w:val="clear"/>
+            <w:tcMar>
+              <w:top w:type="dxa" w:w="80"/>
+              <w:left w:type="dxa" w:w="120"/>
+              <w:bottom w:type="dxa" w:w="80"/>
+              <w:right w:type="dxa" w:w="120"/>
+            </w:tcMar>
+          </w:tcPr>
+          <w:p>
+            <w:r>
+              <w:rPr>
+                <w:rFonts w:ascii="Arial" w:cs="Arial" w:eastAsia="Arial" w:hAnsi="Arial"/>
+                <w:b/>
+                <w:bCs/>
+                <w:sz w:val="22"/>
+                <w:szCs w:val="22"/>
+              </w:rPr>
+              <w:t xml:space="preserve">Depois</w:t>
+            </w:r>
+          </w:p>
+        </w:tc>
+      </w:tr>
+      <w:tr>
+        <w:tc>
+          <w:tcPr>
+            <w:tcW w:type="dxa" w:w="4526"/>
+            <w:tcBorders>
+              <w:top w:val="single" w:color="999999" w:sz="4"/>
+              <w:left w:val="single" w:color="999999" w:sz="4"/>
+              <w:bottom w:val="single" w:color="999999" w:sz="4"/>
+              <w:right w:val="single" w:color="999999" w:sz="4"/>
+            </w:tcBorders>
+            <w:tcMar>
+              <w:top w:type="dxa" w:w="80"/>
+              <w:left w:type="dxa" w:w="120"/>
+              <w:bottom w:type="dxa" w:w="80"/>
+              <w:right w:type="dxa" w:w="120"/>
+            </w:tcMar>
+          </w:tcPr>
+          <w:p>
+            <w:r>
+              <w:rPr>
+                <w:rFonts w:ascii="Arial" w:cs="Arial" w:eastAsia="Arial" w:hAnsi="Arial"/>
+                <w:b w:val="false"/>
+                <w:bCs w:val="false"/>
+                <w:sz w:val="22"/>
+                <w:szCs w:val="22"/>
+              </w:rPr>
+              <w:t xml:space="preserve">Chamados no período</w:t>
+            </w:r>
+          </w:p>
+        </w:tc>
+        <w:tc>
+          <w:tcPr>
+            <w:tcW w:type="dxa" w:w="2250"/>
+            <w:tcBorders>
+              <w:top w:val="single" w:color="999999" w:sz="4"/>
+              <w:left w:val="single" w:color="999999" w:sz="4"/>
+              <w:bottom w:val="single" w:color="999999" w:sz="4"/>
+              <w:right w:val="single" w:color="999999" w:sz="4"/>
+            </w:tcBorders>
+            <w:tcMar>
+              <w:top w:type="dxa" w:w="80"/>
+              <w:left w:type="dxa" w:w="120"/>
+              <w:bottom w:type="dxa" w:w="80"/>
+              <w:right w:type="dxa" w:w="120"/>
+            </w:tcMar>
+          </w:tcPr>
+          <w:p>
+            <w:r>
+              <w:rPr>
+                <w:rFonts w:ascii="Arial" w:cs="Arial" w:eastAsia="Arial" w:hAnsi="Arial"/>
+                <w:b w:val="false"/>
+                <w:bCs w:val="false"/>
+                <w:sz w:val="22"/>
+                <w:szCs w:val="22"/>
+              </w:rPr>
+              <w:t xml:space="preserve">86 (10 dias úteis)</w:t>
+            </w:r>
+          </w:p>
+        </w:tc>
+        <w:tc>
+          <w:tcPr>
+            <w:tcW w:type="dxa" w:w="2250"/>
+            <w:tcBorders>
+              <w:top w:val="single" w:color="999999" w:sz="4"/>
+              <w:left w:val="single" w:color="999999" w:sz="4"/>
+              <w:bottom w:val="single" w:color="999999" w:sz="4"/>
+              <w:right w:val="single" w:color="999999" w:sz="4"/>
+            </w:tcBorders>
+            <w:tcMar>
+              <w:top w:type="dxa" w:w="80"/>
+              <w:left w:type="dxa" w:w="120"/>
+              <w:bottom w:type="dxa" w:w="80"/>
+              <w:right w:type="dxa" w:w="120"/>
+            </w:tcMar>
+          </w:tcPr>
+          <w:p>
+            <w:r>
+              <w:rPr>
+                <w:rFonts w:ascii="Arial" w:cs="Arial" w:eastAsia="Arial" w:hAnsi="Arial"/>
+                <w:b w:val="false"/>
+                <w:bCs w:val="false"/>
+                <w:sz w:val="22"/>
+                <w:szCs w:val="22"/>
+              </w:rPr>
+              <w:t xml:space="preserve">41 (5 dias úteis)</w:t>
+            </w:r>
+          </w:p>
+        </w:tc>
+      </w:tr>
+      <w:tr>
+        <w:tc>
+          <w:tcPr>
+            <w:tcW w:type="dxa" w:w="4526"/>
+            <w:tcBorders>
+              <w:top w:val="single" w:color="999999" w:sz="4"/>
+              <w:left w:val="single" w:color="999999" w:sz="4"/>
+              <w:bottom w:val="single" w:color="999999" w:sz="4"/>
+              <w:right w:val="single" w:color="999999" w:sz="4"/>
+            </w:tcBorders>
+            <w:tcMar>
+              <w:top w:type="dxa" w:w="80"/>
+              <w:left w:type="dxa" w:w="120"/>
+              <w:bottom w:type="dxa" w:w="80"/>
+              <w:right w:type="dxa" w:w="120"/>
+            </w:tcMar>
+          </w:tcPr>
+          <w:p>
+            <w:r>
+              <w:rPr>
+                <w:rFonts w:ascii="Arial" w:cs="Arial" w:eastAsia="Arial" w:hAnsi="Arial"/>
+                <w:b w:val="false"/>
+                <w:bCs w:val="false"/>
+                <w:sz w:val="22"/>
+                <w:szCs w:val="22"/>
+              </w:rPr>
+              <w:t xml:space="preserve">Incidentes / requisições / problemas</w:t>
+            </w:r>
+          </w:p>
+        </w:tc>
+        <w:tc>
+          <w:tcPr>
+            <w:tcW w:type="dxa" w:w="2250"/>
+            <w:tcBorders>
+              <w:top w:val="single" w:color="999999" w:sz="4"/>
+              <w:left w:val="single" w:color="999999" w:sz="4"/>
+              <w:bottom w:val="single" w:color="999999" w:sz="4"/>
+              <w:right w:val="single" w:color="999999" w:sz="4"/>
+            </w:tcBorders>
+            <w:tcMar>
+              <w:top w:type="dxa" w:w="80"/>
+              <w:left w:type="dxa" w:w="120"/>
+              <w:bottom w:type="dxa" w:w="80"/>
+              <w:right w:type="dxa" w:w="120"/>
+            </w:tcMar>
+          </w:tcPr>
+          <w:p>
+            <w:r>
+              <w:rPr>
+                <w:rFonts w:ascii="Arial" w:cs="Arial" w:eastAsia="Arial" w:hAnsi="Arial"/>
+                <w:b w:val="false"/>
+                <w:bCs w:val="false"/>
+                <w:sz w:val="22"/>
+                <w:szCs w:val="22"/>
+              </w:rPr>
+              <w:t xml:space="preserve">45 / 39 / 2</w:t>
+            </w:r>
+          </w:p>
+        </w:tc>
+        <w:tc>
+          <w:tcPr>
+            <w:tcW w:type="dxa" w:w="2250"/>
+            <w:tcBorders>
+              <w:top w:val="single" w:color="999999" w:sz="4"/>
+              <w:left w:val="single" w:color="999999" w:sz="4"/>
+              <w:bottom w:val="single" w:color="999999" w:sz="4"/>
+              <w:right w:val="single" w:color="999999" w:sz="4"/>
+            </w:tcBorders>
+            <w:tcMar>
+              <w:top w:type="dxa" w:w="80"/>
+              <w:left w:type="dxa" w:w="120"/>
+              <w:bottom w:type="dxa" w:w="80"/>
+              <w:right w:type="dxa" w:w="120"/>
+            </w:tcMar>
+          </w:tcPr>
+          <w:p>
+            <w:r>
+              <w:rPr>
+                <w:rFonts w:ascii="Arial" w:cs="Arial" w:eastAsia="Arial" w:hAnsi="Arial"/>
+                <w:b w:val="false"/>
+                <w:bCs w:val="false"/>
+                <w:sz w:val="22"/>
+                <w:szCs w:val="22"/>
+              </w:rPr>
+              <w:t xml:space="preserve">24 / 15 / 2</w:t>
+            </w:r>
+          </w:p>
+        </w:tc>
+      </w:tr>
+      <w:tr>
+        <w:tc>
+          <w:tcPr>
+            <w:tcW w:type="dxa" w:w="4526"/>
+            <w:tcBorders>
+              <w:top w:val="single" w:color="999999" w:sz="4"/>
+              <w:left w:val="single" w:color="999999" w:sz="4"/>
+              <w:bottom w:val="single" w:color="999999" w:sz="4"/>
+              <w:right w:val="single" w:color="999999" w:sz="4"/>
+            </w:tcBorders>
+            <w:tcMar>
+              <w:top w:type="dxa" w:w="80"/>
+              <w:left w:type="dxa" w:w="120"/>
+              <w:bottom w:type="dxa" w:w="80"/>
+              <w:right w:type="dxa" w:w="120"/>
+            </w:tcMar>
+          </w:tcPr>
+          <w:p>
+            <w:r>
+              <w:rPr>
+                <w:rFonts w:ascii="Arial" w:cs="Arial" w:eastAsia="Arial" w:hAnsi="Arial"/>
+                <w:b w:val="false"/>
+                <w:bCs w:val="false"/>
+                <w:sz w:val="22"/>
+                <w:szCs w:val="22"/>
+              </w:rPr>
+              <w:t xml:space="preserve">Tempo médio de solução P1 + P2</w:t>
+            </w:r>
+          </w:p>
+        </w:tc>
+        <w:tc>
+          <w:tcPr>
+            <w:tcW w:type="dxa" w:w="2250"/>
+            <w:tcBorders>
+              <w:top w:val="single" w:color="999999" w:sz="4"/>
+              <w:left w:val="single" w:color="999999" w:sz="4"/>
+              <w:bottom w:val="single" w:color="999999" w:sz="4"/>
+              <w:right w:val="single" w:color="999999" w:sz="4"/>
+            </w:tcBorders>
+            <w:tcMar>
+              <w:top w:type="dxa" w:w="80"/>
+              <w:left w:type="dxa" w:w="120"/>
+              <w:bottom w:type="dxa" w:w="80"/>
+              <w:right w:type="dxa" w:w="120"/>
+            </w:tcMar>
+          </w:tcPr>
+          <w:p>
+            <w:r>
+              <w:rPr>
+                <w:rFonts w:ascii="Arial" w:cs="Arial" w:eastAsia="Arial" w:hAnsi="Arial"/>
+                <w:b w:val="false"/>
+                <w:bCs w:val="false"/>
+                <w:sz w:val="22"/>
+                <w:szCs w:val="22"/>
+              </w:rPr>
+              <w:t xml:space="preserve">87,8 min (n = 20)</w:t>
+            </w:r>
+          </w:p>
+        </w:tc>
+        <w:tc>
+          <w:tcPr>
+            <w:tcW w:type="dxa" w:w="2250"/>
+            <w:tcBorders>
+              <w:top w:val="single" w:color="999999" w:sz="4"/>
+              <w:left w:val="single" w:color="999999" w:sz="4"/>
+              <w:bottom w:val="single" w:color="999999" w:sz="4"/>
+              <w:right w:val="single" w:color="999999" w:sz="4"/>
+            </w:tcBorders>
+            <w:tcMar>
+              <w:top w:type="dxa" w:w="80"/>
+              <w:left w:type="dxa" w:w="120"/>
+              <w:bottom w:type="dxa" w:w="80"/>
+              <w:right w:type="dxa" w:w="120"/>
+            </w:tcMar>
+          </w:tcPr>
+          <w:p>
+            <w:r>
+              <w:rPr>
+                <w:rFonts w:ascii="Arial" w:cs="Arial" w:eastAsia="Arial" w:hAnsi="Arial"/>
+                <w:b w:val="false"/>
+                <w:bCs w:val="false"/>
+                <w:sz w:val="22"/>
+                <w:szCs w:val="22"/>
+              </w:rPr>
+              <w:t xml:space="preserve">55,4 min (n = 7)</w:t>
+            </w:r>
+          </w:p>
+        </w:tc>
+      </w:tr>
+      <w:tr>
+        <w:tc>
+          <w:tcPr>
+            <w:tcW w:type="dxa" w:w="4526"/>
+            <w:tcBorders>
+              <w:top w:val="single" w:color="999999" w:sz="4"/>
+              <w:left w:val="single" w:color="999999" w:sz="4"/>
+              <w:bottom w:val="single" w:color="999999" w:sz="4"/>
+              <w:right w:val="single" w:color="999999" w:sz="4"/>
+            </w:tcBorders>
+            <w:tcMar>
+              <w:top w:type="dxa" w:w="80"/>
+              <w:left w:type="dxa" w:w="120"/>
+              <w:bottom w:type="dxa" w:w="80"/>
+              <w:right w:type="dxa" w:w="120"/>
+            </w:tcMar>
+          </w:tcPr>
+          <w:p>
+            <w:r>
+              <w:rPr>
+                <w:rFonts w:ascii="Arial" w:cs="Arial" w:eastAsia="Arial" w:hAnsi="Arial"/>
+                <w:b w:val="false"/>
+                <w:bCs w:val="false"/>
+                <w:sz w:val="22"/>
+                <w:szCs w:val="22"/>
+              </w:rPr>
+              <w:t xml:space="preserve">Tempo médio de solução P3 / P4</w:t>
+            </w:r>
+          </w:p>
+        </w:tc>
+        <w:tc>
+          <w:tcPr>
+            <w:tcW w:type="dxa" w:w="2250"/>
+            <w:tcBorders>
+              <w:top w:val="single" w:color="999999" w:sz="4"/>
+              <w:left w:val="single" w:color="999999" w:sz="4"/>
+              <w:bottom w:val="single" w:color="999999" w:sz="4"/>
+              <w:right w:val="single" w:color="999999" w:sz="4"/>
+            </w:tcBorders>
+            <w:tcMar>
+              <w:top w:type="dxa" w:w="80"/>
+              <w:left w:type="dxa" w:w="120"/>
+              <w:bottom w:type="dxa" w:w="80"/>
+              <w:right w:type="dxa" w:w="120"/>
+            </w:tcMar>
+          </w:tcPr>
+          <w:p>
+            <w:r>
+              <w:rPr>
+                <w:rFonts w:ascii="Arial" w:cs="Arial" w:eastAsia="Arial" w:hAnsi="Arial"/>
+                <w:b w:val="false"/>
+                <w:bCs w:val="false"/>
+                <w:sz w:val="22"/>
+                <w:szCs w:val="22"/>
+              </w:rPr>
+              <w:t xml:space="preserve">39,6 / 40,6 min</w:t>
+            </w:r>
+          </w:p>
+        </w:tc>
+        <w:tc>
+          <w:tcPr>
+            <w:tcW w:type="dxa" w:w="2250"/>
+            <w:tcBorders>
+              <w:top w:val="single" w:color="999999" w:sz="4"/>
+              <w:left w:val="single" w:color="999999" w:sz="4"/>
+              <w:bottom w:val="single" w:color="999999" w:sz="4"/>
+              <w:right w:val="single" w:color="999999" w:sz="4"/>
+            </w:tcBorders>
+            <w:tcMar>
+              <w:top w:type="dxa" w:w="80"/>
+              <w:left w:type="dxa" w:w="120"/>
+              <w:bottom w:type="dxa" w:w="80"/>
+              <w:right w:type="dxa" w:w="120"/>
+            </w:tcMar>
+          </w:tcPr>
+          <w:p>
+            <w:r>
+              <w:rPr>
+                <w:rFonts w:ascii="Arial" w:cs="Arial" w:eastAsia="Arial" w:hAnsi="Arial"/>
+                <w:b w:val="false"/>
+                <w:bCs w:val="false"/>
+                <w:sz w:val="22"/>
+                <w:szCs w:val="22"/>
+              </w:rPr>
+              <w:t xml:space="preserve">46,3 / 52,9 min</w:t>
+            </w:r>
+          </w:p>
+        </w:tc>
+      </w:tr>
+      <w:tr>
+        <w:tc>
+          <w:tcPr>
+            <w:tcW w:type="dxa" w:w="4526"/>
+            <w:tcBorders>
+              <w:top w:val="single" w:color="999999" w:sz="4"/>
+              <w:left w:val="single" w:color="999999" w:sz="4"/>
+              <w:bottom w:val="single" w:color="999999" w:sz="4"/>
+              <w:right w:val="single" w:color="999999" w:sz="4"/>
+            </w:tcBorders>
+            <w:tcMar>
+              <w:top w:type="dxa" w:w="80"/>
+              <w:left w:type="dxa" w:w="120"/>
+              <w:bottom w:type="dxa" w:w="80"/>
+              <w:right w:type="dxa" w:w="120"/>
+            </w:tcMar>
+          </w:tcPr>
+          <w:p>
+            <w:r>
+              <w:rPr>
+                <w:rFonts w:ascii="Arial" w:cs="Arial" w:eastAsia="Arial" w:hAnsi="Arial"/>
+                <w:b w:val="false"/>
+                <w:bCs w:val="false"/>
+                <w:sz w:val="22"/>
+                <w:szCs w:val="22"/>
+              </w:rPr>
+              <w:t xml:space="preserve">Tempo médio geral</w:t>
+            </w:r>
+          </w:p>
+        </w:tc>
+        <w:tc>
+          <w:tcPr>
+            <w:tcW w:type="dxa" w:w="2250"/>
+            <w:tcBorders>
+              <w:top w:val="single" w:color="999999" w:sz="4"/>
+              <w:left w:val="single" w:color="999999" w:sz="4"/>
+              <w:bottom w:val="single" w:color="999999" w:sz="4"/>
+              <w:right w:val="single" w:color="999999" w:sz="4"/>
+            </w:tcBorders>
+            <w:tcMar>
+              <w:top w:type="dxa" w:w="80"/>
+              <w:left w:type="dxa" w:w="120"/>
+              <w:bottom w:type="dxa" w:w="80"/>
+              <w:right w:type="dxa" w:w="120"/>
+            </w:tcMar>
+          </w:tcPr>
+          <w:p>
+            <w:r>
+              <w:rPr>
+                <w:rFonts w:ascii="Arial" w:cs="Arial" w:eastAsia="Arial" w:hAnsi="Arial"/>
+                <w:b w:val="false"/>
+                <w:bCs w:val="false"/>
+                <w:sz w:val="22"/>
+                <w:szCs w:val="22"/>
+              </w:rPr>
+              <w:t xml:space="preserve">51,3 min</w:t>
+            </w:r>
+          </w:p>
+        </w:tc>
+        <w:tc>
+          <w:tcPr>
+            <w:tcW w:type="dxa" w:w="2250"/>
+            <w:tcBorders>
+              <w:top w:val="single" w:color="999999" w:sz="4"/>
+              <w:left w:val="single" w:color="999999" w:sz="4"/>
+              <w:bottom w:val="single" w:color="999999" w:sz="4"/>
+              <w:right w:val="single" w:color="999999" w:sz="4"/>
+            </w:tcBorders>
+            <w:tcMar>
+              <w:top w:type="dxa" w:w="80"/>
+              <w:left w:type="dxa" w:w="120"/>
+              <w:bottom w:type="dxa" w:w="80"/>
+              <w:right w:type="dxa" w:w="120"/>
+            </w:tcMar>
+          </w:tcPr>
+          <w:p>
+            <w:r>
+              <w:rPr>
+                <w:rFonts w:ascii="Arial" w:cs="Arial" w:eastAsia="Arial" w:hAnsi="Arial"/>
+                <w:b w:val="false"/>
+                <w:bCs w:val="false"/>
+                <w:sz w:val="22"/>
+                <w:szCs w:val="22"/>
+              </w:rPr>
+              <w:t xml:space="preserve">51,9 min</w:t>
+            </w:r>
+          </w:p>
+        </w:tc>
+      </w:tr>
+      <w:tr>
+        <w:tc>
+          <w:tcPr>
+            <w:tcW w:type="dxa" w:w="4526"/>
+            <w:tcBorders>
+              <w:top w:val="single" w:color="999999" w:sz="4"/>
+              <w:left w:val="single" w:color="999999" w:sz="4"/>
+              <w:bottom w:val="single" w:color="999999" w:sz="4"/>
+              <w:right w:val="single" w:color="999999" w:sz="4"/>
+            </w:tcBorders>
+            <w:tcMar>
+              <w:top w:type="dxa" w:w="80"/>
+              <w:left w:type="dxa" w:w="120"/>
+              <w:bottom w:type="dxa" w:w="80"/>
+              <w:right w:type="dxa" w:w="120"/>
+            </w:tcMar>
+          </w:tcPr>
+          <w:p>
+            <w:r>
+              <w:rPr>
+                <w:rFonts w:ascii="Arial" w:cs="Arial" w:eastAsia="Arial" w:hAnsi="Arial"/>
+                <w:b w:val="false"/>
+                <w:bCs w:val="false"/>
+                <w:sz w:val="22"/>
+                <w:szCs w:val="22"/>
+              </w:rPr>
+              <w:t xml:space="preserve">Tempo médio de criação de usuário</w:t>
+            </w:r>
+          </w:p>
+        </w:tc>
+        <w:tc>
+          <w:tcPr>
+            <w:tcW w:type="dxa" w:w="2250"/>
+            <w:tcBorders>
+              <w:top w:val="single" w:color="999999" w:sz="4"/>
+              <w:left w:val="single" w:color="999999" w:sz="4"/>
+              <w:bottom w:val="single" w:color="999999" w:sz="4"/>
+              <w:right w:val="single" w:color="999999" w:sz="4"/>
+            </w:tcBorders>
+            <w:tcMar>
+              <w:top w:type="dxa" w:w="80"/>
+              <w:left w:type="dxa" w:w="120"/>
+              <w:bottom w:type="dxa" w:w="80"/>
+              <w:right w:type="dxa" w:w="120"/>
+            </w:tcMar>
+          </w:tcPr>
+          <w:p>
+            <w:r>
+              <w:rPr>
+                <w:rFonts w:ascii="Arial" w:cs="Arial" w:eastAsia="Arial" w:hAnsi="Arial"/>
+                <w:b w:val="false"/>
+                <w:bCs w:val="false"/>
+                <w:sz w:val="22"/>
+                <w:szCs w:val="22"/>
+              </w:rPr>
+              <w:t xml:space="preserve">52,7 min (n = 7)</w:t>
+            </w:r>
+          </w:p>
+        </w:tc>
+        <w:tc>
+          <w:tcPr>
+            <w:tcW w:type="dxa" w:w="2250"/>
+            <w:tcBorders>
+              <w:top w:val="single" w:color="999999" w:sz="4"/>
+              <w:left w:val="single" w:color="999999" w:sz="4"/>
+              <w:bottom w:val="single" w:color="999999" w:sz="4"/>
+              <w:right w:val="single" w:color="999999" w:sz="4"/>
+            </w:tcBorders>
+            <w:tcMar>
+              <w:top w:type="dxa" w:w="80"/>
+              <w:left w:type="dxa" w:w="120"/>
+              <w:bottom w:type="dxa" w:w="80"/>
+              <w:right w:type="dxa" w:w="120"/>
+            </w:tcMar>
+          </w:tcPr>
+          <w:p>
+            <w:r>
+              <w:rPr>
+                <w:rFonts w:ascii="Arial" w:cs="Arial" w:eastAsia="Arial" w:hAnsi="Arial"/>
+                <w:b w:val="false"/>
+                <w:bCs w:val="false"/>
+                <w:sz w:val="22"/>
+                <w:szCs w:val="22"/>
+              </w:rPr>
+              <w:t xml:space="preserve">45,5 min (n = 2)</w:t>
+            </w:r>
+          </w:p>
+        </w:tc>
+      </w:tr>
+    </w:tbl>
+    <w:p>
+      <w:pPr>
+        <w:spacing w:after="160" w:line="360"/>
+        <w:jc w:val="both"/>
+      </w:pPr>
+      <w:r>
+        <w:rPr>
+          <w:rFonts w:ascii="Arial" w:cs="Arial" w:eastAsia="Arial" w:hAnsi="Arial"/>
+          <w:sz w:val="24"/>
+          <w:szCs w:val="24"/>
+        </w:rPr>
+        <w:t xml:space="preserve"/>
+      </w:r>
+    </w:p>
+    <w:tbl>
+      <w:tblPr>
+        <w:tblW w:type="dxa" w:w="9026"/>
+        <w:tblBorders>
+          <w:top w:val="single" w:color="auto" w:sz="4"/>
+          <w:left w:val="single" w:color="auto" w:sz="4"/>
+          <w:bottom w:val="single" w:color="auto" w:sz="4"/>
+          <w:right w:val="single" w:color="auto" w:sz="4"/>
+          <w:insideH w:val="single" w:color="auto" w:sz="4"/>
+          <w:insideV w:val="single" w:color="auto" w:sz="4"/>
+        </w:tblBorders>
+      </w:tblPr>
+      <w:tblGrid>
+        <w:gridCol w:w="6526"/>
         <w:gridCol w:w="2500"/>
       </w:tblGrid>
       <w:tr>
         <w:tc>
           <w:tcPr>
-            <w:tcW w:type="dxa" w:w="4026"/>
+            <w:tcW w:type="dxa" w:w="6526"/>
             <w:tcBorders>
               <w:top w:val="single" w:color="999999" w:sz="4"/>
               <w:left w:val="single" w:color="999999" w:sz="4"/>
@@ -1558,7 +2145,7 @@
                 <w:sz w:val="22"/>
                 <w:szCs w:val="22"/>
               </w:rPr>
-              <w:t xml:space="preserve">Indicador</w:t>
+              <w:t xml:space="preserve">Indicador (levantamento único)</w:t>
             </w:r>
           </w:p>
         </w:tc>
@@ -1588,37 +2175,7 @@
                 <w:sz w:val="22"/>
                 <w:szCs w:val="22"/>
               </w:rPr>
-              <w:t xml:space="preserve">Antes</w:t>
-            </w:r>
-          </w:p>
-        </w:tc>
-        <w:tc>
-          <w:tcPr>
-            <w:tcW w:type="dxa" w:w="2500"/>
-            <w:tcBorders>
-              <w:top w:val="single" w:color="999999" w:sz="4"/>
-              <w:left w:val="single" w:color="999999" w:sz="4"/>
-              <w:bottom w:val="single" w:color="999999" w:sz="4"/>
-              <w:right w:val="single" w:color="999999" w:sz="4"/>
-            </w:tcBorders>
-            <w:shd w:fill="D9E2F3" w:color="auto" w:val="clear"/>
-            <w:tcMar>
-              <w:top w:type="dxa" w:w="80"/>
-              <w:left w:type="dxa" w:w="120"/>
-              <w:bottom w:type="dxa" w:w="80"/>
-              <w:right w:type="dxa" w:w="120"/>
-            </w:tcMar>
-          </w:tcPr>
-          <w:p>
-            <w:r>
-              <w:rPr>
-                <w:rFonts w:ascii="Arial" w:cs="Arial" w:eastAsia="Arial" w:hAnsi="Arial"/>
-                <w:b/>
-                <w:bCs/>
-                <w:sz w:val="22"/>
-                <w:szCs w:val="22"/>
-              </w:rPr>
-              <w:t xml:space="preserve">Depois</w:t>
+              <w:t xml:space="preserve">Resultado</w:t>
             </w:r>
           </w:p>
         </w:tc>
@@ -1626,30 +2183,30 @@
       <w:tr>
         <w:tc>
           <w:tcPr>
-            <w:tcW w:type="dxa" w:w="4026"/>
-            <w:tcBorders>
-              <w:top w:val="single" w:color="999999" w:sz="4"/>
-              <w:left w:val="single" w:color="999999" w:sz="4"/>
-              <w:bottom w:val="single" w:color="999999" w:sz="4"/>
-              <w:right w:val="single" w:color="999999" w:sz="4"/>
-            </w:tcBorders>
-            <w:tcMar>
-              <w:top w:type="dxa" w:w="80"/>
-              <w:left w:type="dxa" w:w="120"/>
-              <w:bottom w:type="dxa" w:w="80"/>
-              <w:right w:type="dxa" w:w="120"/>
-            </w:tcMar>
-          </w:tcPr>
-          <w:p>
-            <w:r>
-              <w:rPr>
-                <w:rFonts w:ascii="Arial" w:cs="Arial" w:eastAsia="Arial" w:hAnsi="Arial"/>
-                <w:b w:val="false"/>
-                <w:bCs w:val="false"/>
-                <w:sz w:val="22"/>
-                <w:szCs w:val="22"/>
-              </w:rPr>
-              <w:t xml:space="preserve">Chamados com categoria correta</w:t>
+            <w:tcW w:type="dxa" w:w="6526"/>
+            <w:tcBorders>
+              <w:top w:val="single" w:color="999999" w:sz="4"/>
+              <w:left w:val="single" w:color="999999" w:sz="4"/>
+              <w:bottom w:val="single" w:color="999999" w:sz="4"/>
+              <w:right w:val="single" w:color="999999" w:sz="4"/>
+            </w:tcBorders>
+            <w:tcMar>
+              <w:top w:type="dxa" w:w="80"/>
+              <w:left w:type="dxa" w:w="120"/>
+              <w:bottom w:type="dxa" w:w="80"/>
+              <w:right w:type="dxa" w:w="120"/>
+            </w:tcMar>
+          </w:tcPr>
+          <w:p>
+            <w:r>
+              <w:rPr>
+                <w:rFonts w:ascii="Arial" w:cs="Arial" w:eastAsia="Arial" w:hAnsi="Arial"/>
+                <w:b w:val="false"/>
+                <w:bCs w:val="false"/>
+                <w:sz w:val="22"/>
+                <w:szCs w:val="22"/>
+              </w:rPr>
+              <w:t xml:space="preserve">Categoria mais frequente</w:t>
             </w:r>
           </w:p>
         </w:tc>
@@ -1673,39 +2230,12 @@
             <w:r>
               <w:rPr>
                 <w:rFonts w:ascii="Arial" w:cs="Arial" w:eastAsia="Arial" w:hAnsi="Arial"/>
-                <w:sz w:val="24"/>
-                <w:szCs w:val="24"/>
-                <w:shd w:fill="FFF200" w:color="auto" w:val="clear"/>
-              </w:rPr>
-              <w:t xml:space="preserve">[%]</w:t>
-            </w:r>
-          </w:p>
-        </w:tc>
-        <w:tc>
-          <w:tcPr>
-            <w:tcW w:type="dxa" w:w="2500"/>
-            <w:tcBorders>
-              <w:top w:val="single" w:color="999999" w:sz="4"/>
-              <w:left w:val="single" w:color="999999" w:sz="4"/>
-              <w:bottom w:val="single" w:color="999999" w:sz="4"/>
-              <w:right w:val="single" w:color="999999" w:sz="4"/>
-            </w:tcBorders>
-            <w:tcMar>
-              <w:top w:type="dxa" w:w="80"/>
-              <w:left w:type="dxa" w:w="120"/>
-              <w:bottom w:type="dxa" w:w="80"/>
-              <w:right w:type="dxa" w:w="120"/>
-            </w:tcMar>
-          </w:tcPr>
-          <w:p>
-            <w:r>
-              <w:rPr>
-                <w:rFonts w:ascii="Arial" w:cs="Arial" w:eastAsia="Arial" w:hAnsi="Arial"/>
-                <w:sz w:val="24"/>
-                <w:szCs w:val="24"/>
-                <w:shd w:fill="FFF200" w:color="auto" w:val="clear"/>
-              </w:rPr>
-              <w:t xml:space="preserve">[%]</w:t>
+                <w:b w:val="false"/>
+                <w:bCs w:val="false"/>
+                <w:sz w:val="22"/>
+                <w:szCs w:val="22"/>
+              </w:rPr>
+              <w:t xml:space="preserve">Senha / conta bloqueada: 21 de 86 (24%)</w:t>
             </w:r>
           </w:p>
         </w:tc>
@@ -1713,30 +2243,30 @@
       <w:tr>
         <w:tc>
           <w:tcPr>
-            <w:tcW w:type="dxa" w:w="4026"/>
-            <w:tcBorders>
-              <w:top w:val="single" w:color="999999" w:sz="4"/>
-              <w:left w:val="single" w:color="999999" w:sz="4"/>
-              <w:bottom w:val="single" w:color="999999" w:sz="4"/>
-              <w:right w:val="single" w:color="999999" w:sz="4"/>
-            </w:tcBorders>
-            <w:tcMar>
-              <w:top w:type="dxa" w:w="80"/>
-              <w:left w:type="dxa" w:w="120"/>
-              <w:bottom w:type="dxa" w:w="80"/>
-              <w:right w:type="dxa" w:w="120"/>
-            </w:tcMar>
-          </w:tcPr>
-          <w:p>
-            <w:r>
-              <w:rPr>
-                <w:rFonts w:ascii="Arial" w:cs="Arial" w:eastAsia="Arial" w:hAnsi="Arial"/>
-                <w:b w:val="false"/>
-                <w:bCs w:val="false"/>
-                <w:sz w:val="22"/>
-                <w:szCs w:val="22"/>
-              </w:rPr>
-              <w:t xml:space="preserve">Contas ativas de ex-colaboradores encontradas</w:t>
+            <w:tcW w:type="dxa" w:w="6526"/>
+            <w:tcBorders>
+              <w:top w:val="single" w:color="999999" w:sz="4"/>
+              <w:left w:val="single" w:color="999999" w:sz="4"/>
+              <w:bottom w:val="single" w:color="999999" w:sz="4"/>
+              <w:right w:val="single" w:color="999999" w:sz="4"/>
+            </w:tcBorders>
+            <w:tcMar>
+              <w:top w:type="dxa" w:w="80"/>
+              <w:left w:type="dxa" w:w="120"/>
+              <w:bottom w:type="dxa" w:w="80"/>
+              <w:right w:type="dxa" w:w="120"/>
+            </w:tcMar>
+          </w:tcPr>
+          <w:p>
+            <w:r>
+              <w:rPr>
+                <w:rFonts w:ascii="Arial" w:cs="Arial" w:eastAsia="Arial" w:hAnsi="Arial"/>
+                <w:b w:val="false"/>
+                <w:bCs w:val="false"/>
+                <w:sz w:val="22"/>
+                <w:szCs w:val="22"/>
+              </w:rPr>
+              <w:t xml:space="preserve">Acerto da IA na categoria</w:t>
             </w:r>
           </w:p>
         </w:tc>
@@ -1760,39 +2290,12 @@
             <w:r>
               <w:rPr>
                 <w:rFonts w:ascii="Arial" w:cs="Arial" w:eastAsia="Arial" w:hAnsi="Arial"/>
-                <w:sz w:val="24"/>
-                <w:szCs w:val="24"/>
-                <w:shd w:fill="FFF200" w:color="auto" w:val="clear"/>
-              </w:rPr>
-              <w:t xml:space="preserve">[qtd]</w:t>
-            </w:r>
-          </w:p>
-        </w:tc>
-        <w:tc>
-          <w:tcPr>
-            <w:tcW w:type="dxa" w:w="2500"/>
-            <w:tcBorders>
-              <w:top w:val="single" w:color="999999" w:sz="4"/>
-              <w:left w:val="single" w:color="999999" w:sz="4"/>
-              <w:bottom w:val="single" w:color="999999" w:sz="4"/>
-              <w:right w:val="single" w:color="999999" w:sz="4"/>
-            </w:tcBorders>
-            <w:tcMar>
-              <w:top w:type="dxa" w:w="80"/>
-              <w:left w:type="dxa" w:w="120"/>
-              <w:bottom w:type="dxa" w:w="80"/>
-              <w:right w:type="dxa" w:w="120"/>
-            </w:tcMar>
-          </w:tcPr>
-          <w:p>
-            <w:r>
-              <w:rPr>
-                <w:rFonts w:ascii="Arial" w:cs="Arial" w:eastAsia="Arial" w:hAnsi="Arial"/>
-                <w:sz w:val="24"/>
-                <w:szCs w:val="24"/>
-                <w:shd w:fill="FFF200" w:color="auto" w:val="clear"/>
-              </w:rPr>
-              <w:t xml:space="preserve">[qtd após revisão]</w:t>
+                <w:b w:val="false"/>
+                <w:bCs w:val="false"/>
+                <w:sz w:val="22"/>
+                <w:szCs w:val="22"/>
+              </w:rPr>
+              <w:t xml:space="preserve">27 de 30 (90%)</w:t>
             </w:r>
           </w:p>
         </w:tc>
@@ -1800,30 +2303,30 @@
       <w:tr>
         <w:tc>
           <w:tcPr>
-            <w:tcW w:type="dxa" w:w="4026"/>
-            <w:tcBorders>
-              <w:top w:val="single" w:color="999999" w:sz="4"/>
-              <w:left w:val="single" w:color="999999" w:sz="4"/>
-              <w:bottom w:val="single" w:color="999999" w:sz="4"/>
-              <w:right w:val="single" w:color="999999" w:sz="4"/>
-            </w:tcBorders>
-            <w:tcMar>
-              <w:top w:type="dxa" w:w="80"/>
-              <w:left w:type="dxa" w:w="120"/>
-              <w:bottom w:type="dxa" w:w="80"/>
-              <w:right w:type="dxa" w:w="120"/>
-            </w:tcMar>
-          </w:tcPr>
-          <w:p>
-            <w:r>
-              <w:rPr>
-                <w:rFonts w:ascii="Arial" w:cs="Arial" w:eastAsia="Arial" w:hAnsi="Arial"/>
-                <w:b w:val="false"/>
-                <w:bCs w:val="false"/>
-                <w:sz w:val="22"/>
-                <w:szCs w:val="22"/>
-              </w:rPr>
-              <w:t xml:space="preserve">Equipamentos de desligados recolhidos para reuso</w:t>
+            <w:tcW w:type="dxa" w:w="6526"/>
+            <w:tcBorders>
+              <w:top w:val="single" w:color="999999" w:sz="4"/>
+              <w:left w:val="single" w:color="999999" w:sz="4"/>
+              <w:bottom w:val="single" w:color="999999" w:sz="4"/>
+              <w:right w:val="single" w:color="999999" w:sz="4"/>
+            </w:tcBorders>
+            <w:tcMar>
+              <w:top w:type="dxa" w:w="80"/>
+              <w:left w:type="dxa" w:w="120"/>
+              <w:bottom w:type="dxa" w:w="80"/>
+              <w:right w:type="dxa" w:w="120"/>
+            </w:tcMar>
+          </w:tcPr>
+          <w:p>
+            <w:r>
+              <w:rPr>
+                <w:rFonts w:ascii="Arial" w:cs="Arial" w:eastAsia="Arial" w:hAnsi="Arial"/>
+                <w:b w:val="false"/>
+                <w:bCs w:val="false"/>
+                <w:sz w:val="22"/>
+                <w:szCs w:val="22"/>
+              </w:rPr>
+              <w:t xml:space="preserve">Contas habilitadas sem logon há mais de 90 dias</w:t>
             </w:r>
           </w:p>
         </w:tc>
@@ -1847,39 +2350,12 @@
             <w:r>
               <w:rPr>
                 <w:rFonts w:ascii="Arial" w:cs="Arial" w:eastAsia="Arial" w:hAnsi="Arial"/>
-                <w:sz w:val="24"/>
-                <w:szCs w:val="24"/>
-                <w:shd w:fill="FFF200" w:color="auto" w:val="clear"/>
-              </w:rPr>
-              <w:t xml:space="preserve">[qtd]</w:t>
-            </w:r>
-          </w:p>
-        </w:tc>
-        <w:tc>
-          <w:tcPr>
-            <w:tcW w:type="dxa" w:w="2500"/>
-            <w:tcBorders>
-              <w:top w:val="single" w:color="999999" w:sz="4"/>
-              <w:left w:val="single" w:color="999999" w:sz="4"/>
-              <w:bottom w:val="single" w:color="999999" w:sz="4"/>
-              <w:right w:val="single" w:color="999999" w:sz="4"/>
-            </w:tcBorders>
-            <w:tcMar>
-              <w:top w:type="dxa" w:w="80"/>
-              <w:left w:type="dxa" w:w="120"/>
-              <w:bottom w:type="dxa" w:w="80"/>
-              <w:right w:type="dxa" w:w="120"/>
-            </w:tcMar>
-          </w:tcPr>
-          <w:p>
-            <w:r>
-              <w:rPr>
-                <w:rFonts w:ascii="Arial" w:cs="Arial" w:eastAsia="Arial" w:hAnsi="Arial"/>
-                <w:sz w:val="24"/>
-                <w:szCs w:val="24"/>
-                <w:shd w:fill="FFF200" w:color="auto" w:val="clear"/>
-              </w:rPr>
-              <w:t xml:space="preserve">[qtd]</w:t>
+                <w:b w:val="false"/>
+                <w:bCs w:val="false"/>
+                <w:sz w:val="22"/>
+                <w:szCs w:val="22"/>
+              </w:rPr>
+              <w:t xml:space="preserve">42</w:t>
             </w:r>
           </w:p>
         </w:tc>
@@ -1887,30 +2363,30 @@
       <w:tr>
         <w:tc>
           <w:tcPr>
-            <w:tcW w:type="dxa" w:w="4026"/>
-            <w:tcBorders>
-              <w:top w:val="single" w:color="999999" w:sz="4"/>
-              <w:left w:val="single" w:color="999999" w:sz="4"/>
-              <w:bottom w:val="single" w:color="999999" w:sz="4"/>
-              <w:right w:val="single" w:color="999999" w:sz="4"/>
-            </w:tcBorders>
-            <w:tcMar>
-              <w:top w:type="dxa" w:w="80"/>
-              <w:left w:type="dxa" w:w="120"/>
-              <w:bottom w:type="dxa" w:w="80"/>
-              <w:right w:type="dxa" w:w="120"/>
-            </w:tcMar>
-          </w:tcPr>
-          <w:p>
-            <w:r>
-              <w:rPr>
-                <w:rFonts w:ascii="Arial" w:cs="Arial" w:eastAsia="Arial" w:hAnsi="Arial"/>
-                <w:b w:val="false"/>
-                <w:bCs w:val="false"/>
-                <w:sz w:val="22"/>
-                <w:szCs w:val="22"/>
-              </w:rPr>
-              <w:t xml:space="preserve">Tempo médio de criação de usuário (AD + WMS)</w:t>
+            <w:tcW w:type="dxa" w:w="6526"/>
+            <w:tcBorders>
+              <w:top w:val="single" w:color="999999" w:sz="4"/>
+              <w:left w:val="single" w:color="999999" w:sz="4"/>
+              <w:bottom w:val="single" w:color="999999" w:sz="4"/>
+              <w:right w:val="single" w:color="999999" w:sz="4"/>
+            </w:tcBorders>
+            <w:tcMar>
+              <w:top w:type="dxa" w:w="80"/>
+              <w:left w:type="dxa" w:w="120"/>
+              <w:bottom w:type="dxa" w:w="80"/>
+              <w:right w:type="dxa" w:w="120"/>
+            </w:tcMar>
+          </w:tcPr>
+          <w:p>
+            <w:r>
+              <w:rPr>
+                <w:rFonts w:ascii="Arial" w:cs="Arial" w:eastAsia="Arial" w:hAnsi="Arial"/>
+                <w:b w:val="false"/>
+                <w:bCs w:val="false"/>
+                <w:sz w:val="22"/>
+                <w:szCs w:val="22"/>
+              </w:rPr>
+              <w:t xml:space="preserve">Dessas, contas de ex-colaboradores (cruzamento com o RH)</w:t>
             </w:r>
           </w:p>
         </w:tc>
@@ -1934,11 +2410,43 @@
             <w:r>
               <w:rPr>
                 <w:rFonts w:ascii="Arial" w:cs="Arial" w:eastAsia="Arial" w:hAnsi="Arial"/>
-                <w:sz w:val="24"/>
-                <w:szCs w:val="24"/>
-                <w:shd w:fill="FFF200" w:color="auto" w:val="clear"/>
-              </w:rPr>
-              <w:t xml:space="preserve">[min]</w:t>
+                <w:b w:val="false"/>
+                <w:bCs w:val="false"/>
+                <w:sz w:val="22"/>
+                <w:szCs w:val="22"/>
+              </w:rPr>
+              <w:t xml:space="preserve">9 (21%)</w:t>
+            </w:r>
+          </w:p>
+        </w:tc>
+      </w:tr>
+      <w:tr>
+        <w:tc>
+          <w:tcPr>
+            <w:tcW w:type="dxa" w:w="6526"/>
+            <w:tcBorders>
+              <w:top w:val="single" w:color="999999" w:sz="4"/>
+              <w:left w:val="single" w:color="999999" w:sz="4"/>
+              <w:bottom w:val="single" w:color="999999" w:sz="4"/>
+              <w:right w:val="single" w:color="999999" w:sz="4"/>
+            </w:tcBorders>
+            <w:tcMar>
+              <w:top w:type="dxa" w:w="80"/>
+              <w:left w:type="dxa" w:w="120"/>
+              <w:bottom w:type="dxa" w:w="80"/>
+              <w:right w:type="dxa" w:w="120"/>
+            </w:tcMar>
+          </w:tcPr>
+          <w:p>
+            <w:r>
+              <w:rPr>
+                <w:rFonts w:ascii="Arial" w:cs="Arial" w:eastAsia="Arial" w:hAnsi="Arial"/>
+                <w:b w:val="false"/>
+                <w:bCs w:val="false"/>
+                <w:sz w:val="22"/>
+                <w:szCs w:val="22"/>
+              </w:rPr>
+              <w:t xml:space="preserve">Contas desabilitadas após a revisão</w:t>
             </w:r>
           </w:p>
         </w:tc>
@@ -1962,11 +2470,12 @@
             <w:r>
               <w:rPr>
                 <w:rFonts w:ascii="Arial" w:cs="Arial" w:eastAsia="Arial" w:hAnsi="Arial"/>
-                <w:sz w:val="24"/>
-                <w:szCs w:val="24"/>
-                <w:shd w:fill="FFF200" w:color="auto" w:val="clear"/>
-              </w:rPr>
-              <w:t xml:space="preserve">[min]</w:t>
+                <w:b w:val="false"/>
+                <w:bCs w:val="false"/>
+                <w:sz w:val="22"/>
+                <w:szCs w:val="22"/>
+              </w:rPr>
+              <w:t xml:space="preserve">9</w:t>
             </w:r>
           </w:p>
         </w:tc>
@@ -1997,7 +2506,7 @@
           <w:sz w:val="24"/>
           <w:szCs w:val="24"/>
         </w:rPr>
-        <w:t xml:space="preserve">Produtos entregues: base de dados de chamados com consultas SQL, matriz de prioridade, tabela de categorias e checklist de concessão e revogação de acessos, disponibilizados para a equipe de suporte.</w:t>
+        <w:t xml:space="preserve">Análise: o tempo dos chamados críticos (P1 + P2) caiu cerca de 37%, mas o tempo médio geral ficou praticamente igual, porque os P3 e P4 passaram a esperar mais. Isso é o efeito esperado de uma matriz de prioridade: ela não cria capacidade de atendimento, ela redistribui a fila em favor do que para a operação. Numa aplicação real, esse é o indicador a acompanhar, para que os P4 não fiquem esquecidos.</w:t>
       </w:r>
     </w:p>
     <w:p>
@@ -2011,33 +2520,49 @@
           <w:sz w:val="24"/>
           <w:szCs w:val="24"/>
         </w:rPr>
-        <w:t xml:space="preserve">Os objetivos </w:t>
-      </w:r>
-      <w:r>
-        <w:rPr>
-          <w:rFonts w:ascii="Arial" w:cs="Arial" w:eastAsia="Arial" w:hAnsi="Arial"/>
-          <w:sz w:val="24"/>
-          <w:szCs w:val="24"/>
-          <w:shd w:fill="FFF200" w:color="auto" w:val="clear"/>
-        </w:rPr>
-        <w:t xml:space="preserve">[foram / foram parcialmente]</w:t>
-      </w:r>
-      <w:r>
-        <w:rPr>
-          <w:rFonts w:ascii="Arial" w:cs="Arial" w:eastAsia="Arial" w:hAnsi="Arial"/>
-          <w:sz w:val="24"/>
-          <w:szCs w:val="24"/>
-        </w:rPr>
-        <w:t xml:space="preserve"> atingidos. </w:t>
-      </w:r>
-      <w:r>
-        <w:rPr>
-          <w:rFonts w:ascii="Arial" w:cs="Arial" w:eastAsia="Arial" w:hAnsi="Arial"/>
-          <w:sz w:val="24"/>
-          <w:szCs w:val="24"/>
-          <w:shd w:fill="FFF200" w:color="auto" w:val="clear"/>
-        </w:rPr>
-        <w:t xml:space="preserve">[Explique em 2 ou 3 linhas o que funcionou e o que ficou pendente.]</w:t>
+        <w:t xml:space="preserve">Na IA, os três erros foram todos em descrições ambíguas ("Sistema não deixa entrar" e "Coletor não loga no WMS"). A IA respondeu "senha bloqueada", enquanto o analista, que conhecia a solução, classificou como WMS fora do ar e coletor sem conexão. A IA acelera a triagem, mas não substitui a conferência humana.</w:t>
+      </w:r>
+    </w:p>
+    <w:p>
+      <w:pPr>
+        <w:spacing w:after="160" w:line="360"/>
+        <w:jc w:val="both"/>
+      </w:pPr>
+      <w:r>
+        <w:rPr>
+          <w:rFonts w:ascii="Arial" w:cs="Arial" w:eastAsia="Arial" w:hAnsi="Arial"/>
+          <w:sz w:val="24"/>
+          <w:szCs w:val="24"/>
+        </w:rPr>
+        <w:t xml:space="preserve">Na revisão de contas, 9 ex-colaboradores ainda tinham acesso ao domínio, o que mostra a falha de comunicação entre RH e TI que o checklist de desligamento passa a cobrir. Como melhoria futura, o volume de chamados de senha (24%) justifica avaliar uma ferramenta de redefinição de senha por autoatendimento.</w:t>
+      </w:r>
+    </w:p>
+    <w:p>
+      <w:pPr>
+        <w:spacing w:after="160" w:line="360"/>
+        <w:jc w:val="both"/>
+      </w:pPr>
+      <w:r>
+        <w:rPr>
+          <w:rFonts w:ascii="Arial" w:cs="Arial" w:eastAsia="Arial" w:hAnsi="Arial"/>
+          <w:sz w:val="24"/>
+          <w:szCs w:val="24"/>
+        </w:rPr>
+        <w:t xml:space="preserve">Limitações: os dados são fictícios, o período "Depois" tem apenas 5 dias úteis e algumas amostras são pequenas (1 chamado P1 e 2 criações de usuário no período "Depois"). Os resultados validam o método de medição, não o ganho real.</w:t>
+      </w:r>
+    </w:p>
+    <w:p>
+      <w:pPr>
+        <w:spacing w:after="160" w:line="360"/>
+        <w:jc w:val="both"/>
+      </w:pPr>
+      <w:r>
+        <w:rPr>
+          <w:rFonts w:ascii="Arial" w:cs="Arial" w:eastAsia="Arial" w:hAnsi="Arial"/>
+          <w:sz w:val="24"/>
+          <w:szCs w:val="24"/>
+        </w:rPr>
+        <w:t xml:space="preserve">Produtos entregues: base de chamados em planilha e em SQLite com consultas SQL, matriz de prioridade, checklist de acessos, script PowerShell de revisão de contas e gráficos de acompanhamento.</w:t>
       </w:r>
     </w:p>
     <w:p>
@@ -2067,7 +2592,7 @@
           <w:sz w:val="24"/>
           <w:szCs w:val="24"/>
         </w:rPr>
-        <w:t xml:space="preserve">O projeto mostrou na prática a diferença entre o que a teoria de gerenciamento de serviços propõe e o que acontece no dia a dia do suporte. Separar incidente de requisição parece simples no livro, mas no chão do armazém tudo chega como "o sistema não funciona". A matriz de impacto × urgência deu um critério objetivo para priorizar, e o checklist de acessos transformou uma tarefa feita de memória em um controle verificável, alinhado à ISO/IEC 27002.</w:t>
+        <w:t xml:space="preserve">O projeto mostrou na prática a distância entre a teoria de gerenciamento de serviços e o dia a dia do suporte. Separar incidente de requisição parece simples no livro, mas no chão do armazém tudo chega como "o sistema não funciona". A matriz de impacto × urgência deu um critério objetivo para decidir o que atender primeiro, e o checklist de acessos transformou uma tarefa feita de memória em um controle verificável.</w:t>
       </w:r>
     </w:p>
     <w:p>
@@ -2081,16 +2606,21 @@
           <w:sz w:val="24"/>
           <w:szCs w:val="24"/>
         </w:rPr>
-        <w:t xml:space="preserve">Gestão e Governança em TI deu a base de ITIL e COBIT para separar incidente de requisição e definir responsabilidades. Gestão da TIC ajudou a enxergar o suporte como serviço para a operação. Banco de Dados foi aplicado na modelagem da tabela de chamados e nas consultas que cruzaram contas do AD com a lista do RH. Inteligência Artificial apareceu no uso de IA generativa para classificar descrições, e ficou claro que ela acelera, mas não dispensa a conferência humana. Meio Ambiente e Sustentabilidade entrou no recolhimento de equipamentos no desligamento, que reduz compra nova e descarte eletrônico. </w:t>
-      </w:r>
-      <w:r>
-        <w:rPr>
-          <w:rFonts w:ascii="Arial" w:cs="Arial" w:eastAsia="Arial" w:hAnsi="Arial"/>
-          <w:sz w:val="24"/>
-          <w:szCs w:val="24"/>
-          <w:shd w:fill="FFF200" w:color="auto" w:val="clear"/>
-        </w:rPr>
-        <w:t xml:space="preserve">[Acrescente 1 ou 2 frases suas sobre o que aprendeu.]</w:t>
+        <w:t xml:space="preserve">Gestão e Governança em TI deu a base de ITIL e COBIT para separar incidente de requisição e definir responsabilidades. Gestão da TIC ajudou a enxergar o suporte como um serviço prestado à operação, medido por indicadores. Banco de Dados foi aplicado na modelagem das tabelas e nas consultas que cruzaram as contas do AD com a lista do RH. Inteligência Artificial apareceu no teste de classificação automática, que acertou 90% mas errou justamente nos casos ambíguos. Meio Ambiente e Sustentabilidade entrou no recolhimento de equipamentos no desligamento, que permite reuso e reduz compra nova e descarte eletrônico.</w:t>
+      </w:r>
+    </w:p>
+    <w:p>
+      <w:pPr>
+        <w:spacing w:after="160" w:line="360"/>
+        <w:jc w:val="both"/>
+      </w:pPr>
+      <w:r>
+        <w:rPr>
+          <w:rFonts w:ascii="Arial" w:cs="Arial" w:eastAsia="Arial" w:hAnsi="Arial"/>
+          <w:sz w:val="24"/>
+          <w:szCs w:val="24"/>
+        </w:rPr>
+        <w:t xml:space="preserve">Foram desenvolvidas competências de análise de processos, modelagem e consulta de dados, documentação técnica e visão de segurança da informação. A principal lição foi que um indicador isolado engana: o tempo médio geral ficou igual e esconderia a melhora nos chamados críticos, enquanto olhar só os críticos esconderia a espera maior dos demais.</w:t>
       </w:r>
     </w:p>
     <w:p>
@@ -2111,87 +2641,264 @@
     </w:p>
     <w:p>
       <w:pPr>
-        <w:spacing w:after="120"/>
+        <w:spacing w:after="160" w:line="360"/>
+        <w:jc w:val="both"/>
+      </w:pPr>
+      <w:r>
+        <w:rPr>
+          <w:rFonts w:ascii="Arial" w:cs="Arial" w:eastAsia="Arial" w:hAnsi="Arial"/>
+          <w:sz w:val="24"/>
+          <w:szCs w:val="24"/>
+        </w:rPr>
+        <w:t xml:space="preserve">Registros das etapas executadas no cenário simulado (dados fictícios):</w:t>
+      </w:r>
+    </w:p>
+    <w:p>
+      <w:pPr>
+        <w:spacing w:after="60" w:before="120"/>
+        <w:jc w:val="center"/>
+      </w:pPr>
+      <w:r>
+        <w:drawing>
+          <wp:inline distT="0" distB="0" distL="0" distR="0">
+            <wp:extent cx="5334000" cy="3590925"/>
+            <wp:effectExtent t="0" r="0" b="0" l="0"/>
+            <wp:docPr id="1" name="fig1_matriz.png" descr="Foto 1 – Matriz de prioridade impacto × urgência usada para classificar os chamados." title="Foto 1 – Matriz de prioridade impacto × urgência usada para classificar os chamados."/>
+            <wp:cNvGraphicFramePr>
+              <a:graphicFrameLocks xmlns:a="http://schemas.openxmlformats.org/drawingml/2006/main" noChangeAspect="1"/>
+            </wp:cNvGraphicFramePr>
+            <a:graphic xmlns:a="http://schemas.openxmlformats.org/drawingml/2006/main">
+              <a:graphicData uri="http://schemas.openxmlformats.org/drawingml/2006/picture">
+                <pic:pic xmlns:pic="http://schemas.openxmlformats.org/drawingml/2006/picture">
+                  <pic:nvPicPr>
+                    <pic:cNvPr id="0" name="" descr=""/>
+                    <pic:cNvPicPr>
+                      <a:picLocks noChangeAspect="1" noChangeArrowheads="1"/>
+                    </pic:cNvPicPr>
+                  </pic:nvPicPr>
+                  <pic:blipFill>
+                    <a:blip r:embed="rId7" cstate="none"/>
+                    <a:srcRect/>
+                    <a:stretch>
+                      <a:fillRect/>
+                    </a:stretch>
+                  </pic:blipFill>
+                  <pic:spPr bwMode="auto">
+                    <a:xfrm>
+                      <a:off x="0" y="0"/>
+                      <a:ext cx="5334000" cy="3590925"/>
+                    </a:xfrm>
+                    <a:prstGeom prst="rect">
+                      <a:avLst/>
+                    </a:prstGeom>
+                  </pic:spPr>
+                </pic:pic>
+              </a:graphicData>
+            </a:graphic>
+          </wp:inline>
+        </w:drawing>
+      </w:r>
+    </w:p>
+    <w:p>
+      <w:pPr>
+        <w:spacing w:after="240"/>
+        <w:jc w:val="center"/>
       </w:pPr>
       <w:r>
         <w:rPr>
           <w:rFonts w:ascii="Arial" w:cs="Arial" w:eastAsia="Arial" w:hAnsi="Arial"/>
           <w:i/>
           <w:iCs/>
-          <w:color w:val="666666"/>
           <w:sz w:val="20"/>
           <w:szCs w:val="20"/>
         </w:rPr>
-        <w:t xml:space="preserve">Mínimo 3 fotos reais. Borre nomes de usuários, logins, IPs e dados da empresa. Peça autorização ao seu gestor antes.</w:t>
-      </w:r>
-    </w:p>
-    <w:p>
-      <w:pPr>
-        <w:spacing w:after="160" w:line="360"/>
-        <w:jc w:val="both"/>
-      </w:pPr>
-      <w:r>
-        <w:rPr>
-          <w:rFonts w:ascii="Arial" w:cs="Arial" w:eastAsia="Arial" w:hAnsi="Arial"/>
-          <w:sz w:val="24"/>
-          <w:szCs w:val="24"/>
-        </w:rPr>
-        <w:t xml:space="preserve">Foto 1 – Descrição: </w:t>
-      </w:r>
-      <w:r>
-        <w:rPr>
-          <w:rFonts w:ascii="Arial" w:cs="Arial" w:eastAsia="Arial" w:hAnsi="Arial"/>
-          <w:sz w:val="24"/>
-          <w:szCs w:val="24"/>
-          <w:shd w:fill="FFF200" w:color="auto" w:val="clear"/>
-        </w:rPr>
-        <w:t xml:space="preserve">Tela da planilha de levantamento e classificação dos chamados (dados anonimizados).</w:t>
-      </w:r>
-    </w:p>
-    <w:p>
-      <w:pPr>
-        <w:spacing w:after="160" w:line="360"/>
-        <w:jc w:val="both"/>
-      </w:pPr>
-      <w:r>
-        <w:rPr>
-          <w:rFonts w:ascii="Arial" w:cs="Arial" w:eastAsia="Arial" w:hAnsi="Arial"/>
-          <w:sz w:val="24"/>
-          <w:szCs w:val="24"/>
-        </w:rPr>
-        <w:t xml:space="preserve">Foto 2 – Descrição: </w:t>
-      </w:r>
-      <w:r>
-        <w:rPr>
-          <w:rFonts w:ascii="Arial" w:cs="Arial" w:eastAsia="Arial" w:hAnsi="Arial"/>
-          <w:sz w:val="24"/>
-          <w:szCs w:val="24"/>
-          <w:shd w:fill="FFF200" w:color="auto" w:val="clear"/>
-        </w:rPr>
-        <w:t xml:space="preserve">Matriz de prioridade impacto × urgência impressa ou em tela.</w:t>
-      </w:r>
-    </w:p>
-    <w:p>
-      <w:pPr>
-        <w:spacing w:after="160" w:line="360"/>
-        <w:jc w:val="both"/>
-      </w:pPr>
-      <w:r>
-        <w:rPr>
-          <w:rFonts w:ascii="Arial" w:cs="Arial" w:eastAsia="Arial" w:hAnsi="Arial"/>
-          <w:sz w:val="24"/>
-          <w:szCs w:val="24"/>
-        </w:rPr>
-        <w:t xml:space="preserve">Foto 3 – Descrição: </w:t>
-      </w:r>
-      <w:r>
-        <w:rPr>
-          <w:rFonts w:ascii="Arial" w:cs="Arial" w:eastAsia="Arial" w:hAnsi="Arial"/>
-          <w:sz w:val="24"/>
-          <w:szCs w:val="24"/>
-          <w:shd w:fill="FFF200" w:color="auto" w:val="clear"/>
-        </w:rPr>
-        <w:t xml:space="preserve">Checklist de acessos em uso / apresentação do fluxo à equipe de suporte.</w:t>
+        <w:t xml:space="preserve">Foto 1 – Matriz de prioridade impacto × urgência usada para classificar os chamados.</w:t>
+      </w:r>
+    </w:p>
+    <w:p>
+      <w:pPr>
+        <w:spacing w:after="60" w:before="120"/>
+        <w:jc w:val="center"/>
+      </w:pPr>
+      <w:r>
+        <w:drawing>
+          <wp:inline distT="0" distB="0" distL="0" distR="0">
+            <wp:extent cx="5334000" cy="2809875"/>
+            <wp:effectExtent t="0" r="0" b="0" l="0"/>
+            <wp:docPr id="1" name="fig2_categorias.png" descr="Foto 2 – Levantamento: chamados por categoria no período &quot;Antes&quot; (86 chamados)." title="Foto 2 – Levantamento: chamados por categoria no período &quot;Antes&quot; (86 chamados)."/>
+            <wp:cNvGraphicFramePr>
+              <a:graphicFrameLocks xmlns:a="http://schemas.openxmlformats.org/drawingml/2006/main" noChangeAspect="1"/>
+            </wp:cNvGraphicFramePr>
+            <a:graphic xmlns:a="http://schemas.openxmlformats.org/drawingml/2006/main">
+              <a:graphicData uri="http://schemas.openxmlformats.org/drawingml/2006/picture">
+                <pic:pic xmlns:pic="http://schemas.openxmlformats.org/drawingml/2006/picture">
+                  <pic:nvPicPr>
+                    <pic:cNvPr id="0" name="" descr=""/>
+                    <pic:cNvPicPr>
+                      <a:picLocks noChangeAspect="1" noChangeArrowheads="1"/>
+                    </pic:cNvPicPr>
+                  </pic:nvPicPr>
+                  <pic:blipFill>
+                    <a:blip r:embed="rId8" cstate="none"/>
+                    <a:srcRect/>
+                    <a:stretch>
+                      <a:fillRect/>
+                    </a:stretch>
+                  </pic:blipFill>
+                  <pic:spPr bwMode="auto">
+                    <a:xfrm>
+                      <a:off x="0" y="0"/>
+                      <a:ext cx="5334000" cy="2809875"/>
+                    </a:xfrm>
+                    <a:prstGeom prst="rect">
+                      <a:avLst/>
+                    </a:prstGeom>
+                  </pic:spPr>
+                </pic:pic>
+              </a:graphicData>
+            </a:graphic>
+          </wp:inline>
+        </w:drawing>
+      </w:r>
+    </w:p>
+    <w:p>
+      <w:pPr>
+        <w:spacing w:after="240"/>
+        <w:jc w:val="center"/>
+      </w:pPr>
+      <w:r>
+        <w:rPr>
+          <w:rFonts w:ascii="Arial" w:cs="Arial" w:eastAsia="Arial" w:hAnsi="Arial"/>
+          <w:i/>
+          <w:iCs/>
+          <w:sz w:val="20"/>
+          <w:szCs w:val="20"/>
+        </w:rPr>
+        <w:t xml:space="preserve">Foto 2 – Levantamento: chamados por categoria no período "Antes" (86 chamados).</w:t>
+      </w:r>
+    </w:p>
+    <w:p>
+      <w:pPr>
+        <w:spacing w:after="60" w:before="120"/>
+        <w:jc w:val="center"/>
+      </w:pPr>
+      <w:r>
+        <w:drawing>
+          <wp:inline distT="0" distB="0" distL="0" distR="0">
+            <wp:extent cx="5334000" cy="3524250"/>
+            <wp:effectExtent t="0" r="0" b="0" l="0"/>
+            <wp:docPr id="1" name="fig3_tempo.png" descr="Foto 3 – Tempo médio de solução por prioridade, antes e depois da matriz." title="Foto 3 – Tempo médio de solução por prioridade, antes e depois da matriz."/>
+            <wp:cNvGraphicFramePr>
+              <a:graphicFrameLocks xmlns:a="http://schemas.openxmlformats.org/drawingml/2006/main" noChangeAspect="1"/>
+            </wp:cNvGraphicFramePr>
+            <a:graphic xmlns:a="http://schemas.openxmlformats.org/drawingml/2006/main">
+              <a:graphicData uri="http://schemas.openxmlformats.org/drawingml/2006/picture">
+                <pic:pic xmlns:pic="http://schemas.openxmlformats.org/drawingml/2006/picture">
+                  <pic:nvPicPr>
+                    <pic:cNvPr id="0" name="" descr=""/>
+                    <pic:cNvPicPr>
+                      <a:picLocks noChangeAspect="1" noChangeArrowheads="1"/>
+                    </pic:cNvPicPr>
+                  </pic:nvPicPr>
+                  <pic:blipFill>
+                    <a:blip r:embed="rId9" cstate="none"/>
+                    <a:srcRect/>
+                    <a:stretch>
+                      <a:fillRect/>
+                    </a:stretch>
+                  </pic:blipFill>
+                  <pic:spPr bwMode="auto">
+                    <a:xfrm>
+                      <a:off x="0" y="0"/>
+                      <a:ext cx="5334000" cy="3524250"/>
+                    </a:xfrm>
+                    <a:prstGeom prst="rect">
+                      <a:avLst/>
+                    </a:prstGeom>
+                  </pic:spPr>
+                </pic:pic>
+              </a:graphicData>
+            </a:graphic>
+          </wp:inline>
+        </w:drawing>
+      </w:r>
+    </w:p>
+    <w:p>
+      <w:pPr>
+        <w:spacing w:after="240"/>
+        <w:jc w:val="center"/>
+      </w:pPr>
+      <w:r>
+        <w:rPr>
+          <w:rFonts w:ascii="Arial" w:cs="Arial" w:eastAsia="Arial" w:hAnsi="Arial"/>
+          <w:i/>
+          <w:iCs/>
+          <w:sz w:val="20"/>
+          <w:szCs w:val="20"/>
+        </w:rPr>
+        <w:t xml:space="preserve">Foto 3 – Tempo médio de solução por prioridade, antes e depois da matriz.</w:t>
+      </w:r>
+    </w:p>
+    <w:p>
+      <w:pPr>
+        <w:spacing w:after="60" w:before="120"/>
+        <w:jc w:val="center"/>
+      </w:pPr>
+      <w:r>
+        <w:drawing>
+          <wp:inline distT="0" distB="0" distL="0" distR="0">
+            <wp:extent cx="5334000" cy="3495675"/>
+            <wp:effectExtent t="0" r="0" b="0" l="0"/>
+            <wp:docPr id="1" name="fig4_sql.png" descr="Foto 4 – Consulta SQL no SQLite cruzando contas do AD com desligados do RH (9 contas encontradas)." title="Foto 4 – Consulta SQL no SQLite cruzando contas do AD com desligados do RH (9 contas encontradas)."/>
+            <wp:cNvGraphicFramePr>
+              <a:graphicFrameLocks xmlns:a="http://schemas.openxmlformats.org/drawingml/2006/main" noChangeAspect="1"/>
+            </wp:cNvGraphicFramePr>
+            <a:graphic xmlns:a="http://schemas.openxmlformats.org/drawingml/2006/main">
+              <a:graphicData uri="http://schemas.openxmlformats.org/drawingml/2006/picture">
+                <pic:pic xmlns:pic="http://schemas.openxmlformats.org/drawingml/2006/picture">
+                  <pic:nvPicPr>
+                    <pic:cNvPr id="0" name="" descr=""/>
+                    <pic:cNvPicPr>
+                      <a:picLocks noChangeAspect="1" noChangeArrowheads="1"/>
+                    </pic:cNvPicPr>
+                  </pic:nvPicPr>
+                  <pic:blipFill>
+                    <a:blip r:embed="rId10" cstate="none"/>
+                    <a:srcRect/>
+                    <a:stretch>
+                      <a:fillRect/>
+                    </a:stretch>
+                  </pic:blipFill>
+                  <pic:spPr bwMode="auto">
+                    <a:xfrm>
+                      <a:off x="0" y="0"/>
+                      <a:ext cx="5334000" cy="3495675"/>
+                    </a:xfrm>
+                    <a:prstGeom prst="rect">
+                      <a:avLst/>
+                    </a:prstGeom>
+                  </pic:spPr>
+                </pic:pic>
+              </a:graphicData>
+            </a:graphic>
+          </wp:inline>
+        </w:drawing>
+      </w:r>
+    </w:p>
+    <w:p>
+      <w:pPr>
+        <w:spacing w:after="240"/>
+        <w:jc w:val="center"/>
+      </w:pPr>
+      <w:r>
+        <w:rPr>
+          <w:rFonts w:ascii="Arial" w:cs="Arial" w:eastAsia="Arial" w:hAnsi="Arial"/>
+          <w:i/>
+          <w:iCs/>
+          <w:sz w:val="20"/>
+          <w:szCs w:val="20"/>
+        </w:rPr>
+        <w:t xml:space="preserve">Foto 4 – Consulta SQL no SQLite cruzando contas do AD com desligados do RH (9 contas encontradas).</w:t>
       </w:r>
     </w:p>
     <w:p>

</xml_diff>